<commit_message>
Complete Meeting 2 outlier sensitivity and data quality review
</commit_message>
<xml_diff>
--- a/output/docx/ISYE4031_Group9_Milestone2_Report.docx
+++ b/output/docx/ISYE4031_Group9_Milestone2_Report.docx
@@ -21,7 +21,7 @@
         <w:br/>
         <w:t>Bill Nguyen, Sarah Wang, Cindy Le, Phoenix Moore, Victor Wang</w:t>
         <w:br/>
-        <w:t>Prepared October 21 2026</w:t>
+        <w:t>Prepared October 27 2026</w:t>
       </w:r>
     </w:p>
     <w:p>
@@ -33,7 +33,7 @@
         <w:t>Preliminary answer.</w:t>
       </w:r>
       <w:r>
-        <w:t xml:space="preserve"> The current linear model does not reliably improve on a training-mean forecast. Weak exploratory associations do not yet support using these predictions for trading decisions.</w:t>
+        <w:t xml:space="preserve"> Available earnings and price information does not yet produce reliable improvements over a constant training-mean forecast. Training-only outlier treatments change the results, but none consistently improves both later periods.</w:t>
       </w:r>
     </w:p>
     <w:p>
@@ -41,26 +41,17 @@
         <w:pStyle w:val="Heading1"/>
       </w:pPr>
       <w:r>
-        <w:t>1 Research question</w:t>
+        <w:t>1 Research question and Meeting 1 response</w:t>
       </w:r>
     </w:p>
     <w:p>
       <w:r>
-        <w:t xml:space="preserve">After the initial market reaction to a quarterly earnings announcement, can earnings, price, volume, momentum and volatility information predict the </w:t>
-      </w:r>
-      <w:r>
-        <w:rPr>
-          <w:b/>
-        </w:rPr>
-        <w:t>signed stock return over the next five trading sessions</w:t>
-      </w:r>
-      <w:r>
-        <w:t>? The intended users are investors considering whether to buy, hold, sell or avoid a stock after earnings. Our testable comparison is whether a multiple linear regression reduces later-period MAE and RMSE relative to a constant training-mean prediction.</w:t>
+        <w:t>After the initial earnings reaction, can earnings, price, volume, momentum and volatility information predict the direction and magnitude of the next five-session stock return? We retain signed gains and losses. Investors are the intended users, with buy, hold, sell or avoid decisions as the potential application. Our comparison asks whether regression reduces later-period MAE and RMSE relative to simple forecasts.</w:t>
       </w:r>
     </w:p>
     <w:p>
       <w:r>
-        <w:t>We retain all signed outcomes and predict at reaction-day close. The target covers the following five trading sessions, so the initial reaction-day jump is not part of the response. This analysis uses the existing 400-event pilot; an approximately 100-stock expansion remains a possible later step. All results below come from the existing cached dataset and analysis, rather than a new data retrieval on October 21.</w:t>
+        <w:t>Meeting 1 notes supplied October 27 [1] prioritize longer histories per company, large-surprise and influence checks, outlier sensitivity, and explaining what makes the data informative. We implemented those checks and audited a suggested Kaggle source. The primary sample remains 400 validated events; longer history and additional companies are expansion work rather than completed observations. The question is distinctive because it predicts returns after the initial reaction, rather than including that jump in the target.</w:t>
       </w:r>
     </w:p>
     <w:p>
@@ -73,7 +64,7 @@
     </w:p>
     <w:p>
       <w:r>
-        <w:t>One observation is a company-quarter earnings event. Existing downloaded Alpha Vantage EARNINGS JSON supplies reported dates, EPS estimates/results and surprise [3]. Yahoo Finance prices through yfinance supply daily prices and volume [4]. This run reused those caches, with no new retrieval or paid access. Exact original retrieval timestamps were not recorded; file hashes identify the snapshot. Earnings dates span January 14, 2016-November 20, 2025. The selected symbols are AAPL, AMZN, GOOGL, JNJ, JPM, META, MSFT, NVDA, WMT and XOM; each contributes 40 events. SPY is the benchmark.</w:t>
+        <w:t>Each row is one company-quarter earnings event. Cached Alpha Vantage EARNINGS records provide dates, reported/estimated EPS and surprise [3]. Yahoo Finance through yfinance provides daily prices and volume [4]. The ten symbols are AAPL, AMZN, GOOGL, JNJ, JPM, META, MSFT, NVDA, WMT and XOM. Each contributes 40 events reported January 14, 2016-November 20, 2025. SPY is the market benchmark. This October 27 rebuild reused existing primary caches; original retrieval timestamps were not recorded, so SHA-256 hashes identify the snapshot.</w:t>
       </w:r>
     </w:p>
     <w:tbl>
@@ -154,7 +145,7 @@
                 <w:color w:val="000000"/>
                 <w:sz w:val="16"/>
               </w:rPr>
-              <w:t>Records / treatment</w:t>
+              <w:t>Observations and treatment</w:t>
             </w:r>
           </w:p>
         </w:tc>
@@ -192,7 +183,7 @@
                 <w:color w:val="000000"/>
                 <w:sz w:val="16"/>
               </w:rPr>
-              <w:t>Cached earnings -&gt; parse dates/numbers</w:t>
+              <w:t>Parse cached earnings dates and numbers</w:t>
             </w:r>
           </w:p>
         </w:tc>
@@ -225,7 +216,7 @@
                 <w:color w:val="000000"/>
                 <w:sz w:val="16"/>
               </w:rPr>
-              <w:t>1,105 records; zero exact duplicates or invalid reported dates</w:t>
+              <w:t>1,105 records; no exact duplicates or invalid reported dates</w:t>
             </w:r>
           </w:p>
         </w:tc>
@@ -296,7 +287,7 @@
                 <w:color w:val="000000"/>
                 <w:sz w:val="16"/>
               </w:rPr>
-              <w:t>400 events; 705 records outside this window</w:t>
+              <w:t>400 events; 705 outside the window</w:t>
             </w:r>
           </w:p>
         </w:tc>
@@ -334,7 +325,7 @@
                 <w:color w:val="000000"/>
                 <w:sz w:val="16"/>
               </w:rPr>
-              <w:t>Match to strictly later stock session</w:t>
+              <w:t>Match first stock session strictly after report date</w:t>
             </w:r>
           </w:p>
         </w:tc>
@@ -367,7 +358,7 @@
                 <w:color w:val="000000"/>
                 <w:sz w:val="16"/>
               </w:rPr>
-              <w:t>400 matched; reject any match more than 7 calendar days later</w:t>
+              <w:t>400 matched; reject gaps over seven calendar days</w:t>
             </w:r>
           </w:p>
         </w:tc>
@@ -405,7 +396,7 @@
                 <w:color w:val="000000"/>
                 <w:sz w:val="16"/>
               </w:rPr>
-              <w:t>Construct features and valid stock/SPY targets</w:t>
+              <w:t>Calculate features and require valid stock and SPY targets</w:t>
             </w:r>
           </w:p>
         </w:tc>
@@ -438,7 +429,7 @@
                 <w:color w:val="000000"/>
                 <w:sz w:val="16"/>
               </w:rPr>
-              <w:t>400 complete cases; zero exclusions for missingness</w:t>
+              <w:t>400 complete cases; zero missingness exclusions</w:t>
             </w:r>
           </w:p>
         </w:tc>
@@ -456,7 +447,7 @@
     </w:p>
     <w:p>
       <w:r>
-        <w:t>Prices cover November 2, 2015-January 30, 2026: 2,576 sessions for each stock and SPY. All series have adjusted closes. With reaction index i, the primary target is P[i+5]/P[i]-1; the secondary target subtracts SPY's return over the same dates. The reaction-day jump is excluded from both. Returns are stored as signed decimals and displayed as percentages. No financial values are imputed, and extreme observations are retained.</w:t>
+        <w:t>We predict at the close of the first stock trading day strictly after the reported earnings date, called reaction day i. The raw target is P[i+5]/P[i]-1, covering sessions i+1 through i+5. The secondary target subtracts SPY's return over the same dates. The initial jump is excluded. All series have adjusted closes; price caches contain 2,576 sessions per symbol from November 2, 2015-January 30, 2026. Returns are stored as decimals and displayed as percentages; financial values are not imputed.</w:t>
       </w:r>
     </w:p>
     <w:p>
@@ -469,17 +460,17 @@
         <w:pStyle w:val="Heading1"/>
       </w:pPr>
       <w:r>
-        <w:t>2 Data quality and prediction time availability continued</w:t>
+        <w:t>2 Data quality and prediction time availability</w:t>
       </w:r>
     </w:p>
     <w:p>
       <w:r>
-        <w:t>The all-events table has zero missing values in all 11 candidate predictors and both return targets; the modeling table has zero duplicate event keys, nonfinite values or invalid event-date orderings. Cached prices have zero duplicate/invalid dates, missing close/adjusted-close/volume values, nonpositive closes or negative volumes. These checks establish internal consistency, not vendor accuracy or historical completeness.</w:t>
+        <w:t>All required predictors and targets are nonmissing across the 400 events. There are no duplicate event keys, nonfinite modeling values or invalid timing rows. Cached prices have no duplicate/invalid dates, missing close/adjusted-close/volume values, nonpositive closes or negative volumes. Independent reconstruction of every event's dates, features and targets agrees within 10^-12. These checks establish internal consistency, not vendor accuracy or historical availability.</w:t>
       </w:r>
     </w:p>
     <w:p>
       <w:r>
-        <w:t>Predictors available through reaction-day close are reported/estimated EPS (USD/share), current/prior-quarter surprise (%), reaction-day return, prior 5- and 20-session stock returns, prior 20-return sample volatility, prior 5-session SPY return (decimal returns), and reaction volume divided by prior 20-session mean volume (ratio). Historical return/volume windows end before reaction day. Dollar EPS surprise remains in the data but is omitted from the regression because it exactly equals reported minus estimated EPS. All 400 events' dates, features and targets were independently reconstructed from the caches; maximum numeric difference was below 10^-12.</w:t>
+        <w:t>The model's 10 predictors are current/prior-quarter surprise (%), reported/estimated EPS (USD/share), reaction-day return, prior 5- and 20-session stock returns, prior 20-return sample volatility, prior 5-session SPY return (decimal returns), and abnormal volume (reaction volume divided by prior 20-session mean). Historical windows end before reaction day. Dollar EPS surprise remains in the data but is omitted from OLS because it exactly equals reported minus estimated EPS. No future return enters the predictors.</w:t>
       </w:r>
     </w:p>
     <w:p>
@@ -500,7 +491,7 @@
         <w:drawing>
           <wp:inline xmlns:a="http://schemas.openxmlformats.org/drawingml/2006/main" xmlns:pic="http://schemas.openxmlformats.org/drawingml/2006/picture">
             <wp:extent cx="6080760" cy="2191519"/>
-            <wp:docPr id="1" name="Picture 1" descr="Figure 1. Full signed-return distribution. The vertical line marks zero; all 400 events are retained."/>
+            <wp:docPr id="1" name="Picture 1" descr="Figure 1. Signed returns after reaction day close. All 400 events remain; the vertical line marks zero."/>
             <wp:cNvGraphicFramePr>
               <a:graphicFrameLocks noChangeAspect="1"/>
             </wp:cNvGraphicFramePr>
@@ -536,12 +527,12 @@
         <w:pStyle w:val="Caption"/>
       </w:pPr>
       <w:r>
-        <w:t>Figure 1. Full signed-return distribution. The vertical line marks zero; all 400 events are retained.</w:t>
+        <w:t>Figure 1. Signed returns after reaction day close. All 400 events remain; the vertical line marks zero.</w:t>
       </w:r>
     </w:p>
     <w:p>
       <w:r>
-        <w:t>Positive returns occur in 223 events (55.75%); 177 are negative and none are zero. Mean return is +0.242%, median +0.319%, and standard deviation 4.085 percentage points (pp). The range is -22.196% to +13.496%. Variation greatly exceeds the mean, so small positive forecasts offer little protection against large losses.</w:t>
+        <w:t>There are 223 positive returns (55.75%), 177 negative returns and no zeros. Mean return is +0.242%, median +0.319%, and standard deviation 4.085 percentage points (pp). Returns range from -22.196% to +13.496%. The large spread relative to the mean makes tail errors and a naive comparison important.</w:t>
       </w:r>
     </w:p>
     <w:p>
@@ -554,7 +545,7 @@
         <w:drawing>
           <wp:inline xmlns:a="http://schemas.openxmlformats.org/drawingml/2006/main" xmlns:pic="http://schemas.openxmlformats.org/drawingml/2006/picture">
             <wp:extent cx="6080760" cy="2194525"/>
-            <wp:docPr id="2" name="Picture 2" descr="Figure 2. Full-sample predictor relationships; descriptive fitted lines use all 400 events. These lines are not holdout models."/>
+            <wp:docPr id="2" name="Picture 2" descr="Figure 2. Full sample predictor relationships. The lines are descriptive; n equals 400 in each panel."/>
             <wp:cNvGraphicFramePr>
               <a:graphicFrameLocks noChangeAspect="1"/>
             </wp:cNvGraphicFramePr>
@@ -590,12 +581,12 @@
         <w:pStyle w:val="Caption"/>
       </w:pPr>
       <w:r>
-        <w:t>Figure 2. Full-sample predictor relationships; descriptive fitted lines use all 400 events. These lines are not holdout models.</w:t>
+        <w:t>Figure 2. Full sample predictor relationships. The lines are descriptive; n equals 400 in each panel.</w:t>
       </w:r>
     </w:p>
     <w:p>
       <w:r>
-        <w:t>Surprise has little linear association with future return (r = 0.045); reaction-day return has a modest positive association (r = 0.187), consistent with some continuation but substantial scatter. Seven events have absolute surprise above 100%; XOM's 960% surprise on May 1, 2020 accompanies estimated EPS of $0.05. These are verified source values, retained without winsorization. Small denominators can create large surprise percentages, so influence needs inspection.</w:t>
+        <w:t>Surprise has little linear association with subsequent return (r = 0.045). Reaction-day return has a modest positive association (r = 0.187), consistent with some continuation but substantial scatter. Seven events have absolute surprise above 100%; five are AMZN events. XOM's 960% surprise accompanies estimated EPS of $0.05. Small denominators can create extreme percentages. We retain these genuine source values in the primary analysis and test their influence separately.</w:t>
       </w:r>
     </w:p>
     <w:p>
@@ -608,17 +599,12 @@
         <w:pStyle w:val="Heading1"/>
       </w:pPr>
       <w:r>
-        <w:t>4 Baseline and initial results</w:t>
+        <w:t>4 Baseline results and outlier sensitivity</w:t>
       </w:r>
     </w:p>
     <w:p>
       <w:r>
-        <w:t>We fit ordinary least squares with an intercept and the 10 nonredundant predictors [5]. StandardScaler is fitted only on training observations. The primary response is raw signed return, matching the proposal's decision; SPY-adjusted return is a separate secondary analysis. Future SPY returns are used only to define that response, never as a predictor. No hyperparameter search or outcome-based outlier deletion is performed.</w:t>
-      </w:r>
-    </w:p>
-    <w:p>
-      <w:r>
-        <w:t>The fixed model and training-mean reference use 2016-2022 (n = 280). Validation uses 2023-2024 (n = 80); 2025 is a later exploratory test (n = 40). Splits use reaction dates and exclude earlier-period events whose target ends across the next boundary; this snapshot requires zero purges. Models are not refitted on validation before the 2025 evaluation. Because 2025 has now been inspected, Milestone 3 must not treat it as a fresh untouched test.</w:t>
+        <w:t>OLS with an intercept predicts signed return from the 10 predictors. StandardScaler fits on 2016-2022 training events only (n = 280). The fixed model is evaluated on 2023-2024 (n = 80) and the already inspected 2025 exploratory test (n = 40). Labels crossing split boundaries are excluded; none require purging here. No validation refit or tuning is used. References predict the original training mean (raw +0.154%, adjusted -0.213%) or zero every time. MAE measures average absolute error; RMSE gives larger errors more weight. Both are reported in pp.</w:t>
       </w:r>
     </w:p>
     <w:tbl>
@@ -629,12 +615,11 @@
         <w:tblLook w:firstColumn="1" w:firstRow="1" w:lastColumn="0" w:lastRow="0" w:noHBand="0" w:noVBand="1" w:val="04A0"/>
       </w:tblPr>
       <w:tblGrid>
-        <w:gridCol w:w="2520"/>
-        <w:gridCol w:w="1872"/>
-        <w:gridCol w:w="576"/>
-        <w:gridCol w:w="1728"/>
-        <w:gridCol w:w="1872"/>
+        <w:gridCol w:w="1584"/>
         <w:gridCol w:w="1800"/>
+        <w:gridCol w:w="504"/>
+        <w:gridCol w:w="3168"/>
+        <w:gridCol w:w="3312"/>
       </w:tblGrid>
       <w:tr>
         <w:trPr>
@@ -643,7 +628,7 @@
         </w:trPr>
         <w:tc>
           <w:tcPr>
-            <w:tcW w:type="dxa" w:w="2520"/>
+            <w:tcW w:type="dxa" w:w="1584"/>
             <w:vAlign w:val="center"/>
             <w:tcMar>
               <w:top w:w="65" w:type="dxa"/>
@@ -670,13 +655,13 @@
                 <w:color w:val="000000"/>
                 <w:sz w:val="16"/>
               </w:rPr>
-              <w:t>Target / period</w:t>
+              <w:t>Period</w:t>
             </w:r>
           </w:p>
         </w:tc>
         <w:tc>
           <w:tcPr>
-            <w:tcW w:type="dxa" w:w="1872"/>
+            <w:tcW w:type="dxa" w:w="1800"/>
             <w:vAlign w:val="center"/>
             <w:tcMar>
               <w:top w:w="65" w:type="dxa"/>
@@ -709,7 +694,7 @@
         </w:tc>
         <w:tc>
           <w:tcPr>
-            <w:tcW w:type="dxa" w:w="576"/>
+            <w:tcW w:type="dxa" w:w="504"/>
             <w:vAlign w:val="center"/>
             <w:tcMar>
               <w:top w:w="65" w:type="dxa"/>
@@ -743,7 +728,7 @@
         </w:tc>
         <w:tc>
           <w:tcPr>
-            <w:tcW w:type="dxa" w:w="1728"/>
+            <w:tcW w:type="dxa" w:w="3168"/>
             <w:vAlign w:val="center"/>
             <w:tcMar>
               <w:top w:w="65" w:type="dxa"/>
@@ -771,13 +756,13 @@
                 <w:color w:val="000000"/>
                 <w:sz w:val="16"/>
               </w:rPr>
-              <w:t>MAE (pp)</w:t>
+              <w:t>Raw MAE / RMSE (pp)</w:t>
             </w:r>
           </w:p>
         </w:tc>
         <w:tc>
           <w:tcPr>
-            <w:tcW w:type="dxa" w:w="1872"/>
+            <w:tcW w:type="dxa" w:w="3312"/>
             <w:vAlign w:val="center"/>
             <w:tcMar>
               <w:top w:w="65" w:type="dxa"/>
@@ -805,41 +790,7 @@
                 <w:color w:val="000000"/>
                 <w:sz w:val="16"/>
               </w:rPr>
-              <w:t>RMSE (pp)</w:t>
-            </w:r>
-          </w:p>
-        </w:tc>
-        <w:tc>
-          <w:tcPr>
-            <w:tcW w:type="dxa" w:w="1800"/>
-            <w:vAlign w:val="center"/>
-            <w:tcMar>
-              <w:top w:w="65" w:type="dxa"/>
-              <w:left w:w="85" w:type="dxa"/>
-              <w:bottom w:w="65" w:type="dxa"/>
-              <w:right w:w="85" w:type="dxa"/>
-            </w:tcMar>
-            <w:shd w:fill="E0EAF2"/>
-            <w:tcBorders>
-              <w:top w:val="single" w:sz="4" w:color="D9D9D9"/>
-              <w:left w:val="single" w:sz="4" w:color="D9D9D9"/>
-              <w:bottom w:val="single" w:sz="4" w:color="D9D9D9"/>
-              <w:right w:val="single" w:sz="4" w:color="D9D9D9"/>
-            </w:tcBorders>
-          </w:tcPr>
-          <w:p>
-            <w:pPr>
-              <w:spacing w:after="0" w:line="240" w:lineRule="auto"/>
-              <w:jc w:val="center"/>
-            </w:pPr>
-            <w:r>
-              <w:rPr>
-                <w:rFonts w:ascii="Arial" w:hAnsi="Arial"/>
-                <w:b/>
-                <w:color w:val="000000"/>
-                <w:sz w:val="16"/>
-              </w:rPr>
-              <w:t>R-squared</w:t>
+              <w:t>SPY adjusted MAE / RMSE (pp)</w:t>
             </w:r>
           </w:p>
         </w:tc>
@@ -850,7 +801,7 @@
         </w:trPr>
         <w:tc>
           <w:tcPr>
-            <w:tcW w:type="dxa" w:w="2520"/>
+            <w:tcW w:type="dxa" w:w="1584"/>
             <w:vAlign w:val="center"/>
             <w:tcMar>
               <w:top w:w="65" w:type="dxa"/>
@@ -877,13 +828,13 @@
                 <w:color w:val="000000"/>
                 <w:sz w:val="16"/>
               </w:rPr>
-              <w:t>Raw / 2023-24</w:t>
+              <w:t>2023-24</w:t>
             </w:r>
           </w:p>
         </w:tc>
         <w:tc>
           <w:tcPr>
-            <w:tcW w:type="dxa" w:w="1872"/>
+            <w:tcW w:type="dxa" w:w="1800"/>
             <w:vAlign w:val="center"/>
             <w:tcMar>
               <w:top w:w="65" w:type="dxa"/>
@@ -916,7 +867,7 @@
         </w:tc>
         <w:tc>
           <w:tcPr>
-            <w:tcW w:type="dxa" w:w="576"/>
+            <w:tcW w:type="dxa" w:w="504"/>
             <w:vAlign w:val="center"/>
             <w:tcMar>
               <w:top w:w="65" w:type="dxa"/>
@@ -950,7 +901,7 @@
         </w:tc>
         <w:tc>
           <w:tcPr>
-            <w:tcW w:type="dxa" w:w="1728"/>
+            <w:tcW w:type="dxa" w:w="3168"/>
             <w:vAlign w:val="center"/>
             <w:tcMar>
               <w:top w:w="65" w:type="dxa"/>
@@ -978,13 +929,812 @@
                 <w:color w:val="000000"/>
                 <w:sz w:val="16"/>
               </w:rPr>
-              <w:t>2.906</w:t>
+              <w:t>2.906 / 3.838</w:t>
             </w:r>
           </w:p>
         </w:tc>
         <w:tc>
           <w:tcPr>
-            <w:tcW w:type="dxa" w:w="1872"/>
+            <w:tcW w:type="dxa" w:w="3312"/>
+            <w:vAlign w:val="center"/>
+            <w:tcMar>
+              <w:top w:w="65" w:type="dxa"/>
+              <w:left w:w="85" w:type="dxa"/>
+              <w:bottom w:w="65" w:type="dxa"/>
+              <w:right w:w="85" w:type="dxa"/>
+            </w:tcMar>
+            <w:shd w:fill="F5F5F5"/>
+            <w:tcBorders>
+              <w:top w:val="single" w:sz="4" w:color="D9D9D9"/>
+              <w:left w:val="single" w:sz="4" w:color="D9D9D9"/>
+              <w:bottom w:val="single" w:sz="4" w:color="D9D9D9"/>
+              <w:right w:val="single" w:sz="4" w:color="D9D9D9"/>
+            </w:tcBorders>
+          </w:tcPr>
+          <w:p>
+            <w:pPr>
+              <w:spacing w:after="0" w:line="240" w:lineRule="auto"/>
+              <w:jc w:val="center"/>
+            </w:pPr>
+            <w:r>
+              <w:rPr>
+                <w:rFonts w:ascii="Arial" w:hAnsi="Arial"/>
+                <w:b w:val="0"/>
+                <w:color w:val="000000"/>
+                <w:sz w:val="16"/>
+              </w:rPr>
+              <w:t>2.381 / 3.085</w:t>
+            </w:r>
+          </w:p>
+        </w:tc>
+      </w:tr>
+      <w:tr>
+        <w:trPr>
+          <w:cantSplit/>
+        </w:trPr>
+        <w:tc>
+          <w:tcPr>
+            <w:tcW w:type="dxa" w:w="1584"/>
+            <w:vAlign w:val="center"/>
+            <w:tcMar>
+              <w:top w:w="65" w:type="dxa"/>
+              <w:left w:w="85" w:type="dxa"/>
+              <w:bottom w:w="65" w:type="dxa"/>
+              <w:right w:w="85" w:type="dxa"/>
+            </w:tcMar>
+            <w:shd w:fill="FFFFFF"/>
+            <w:tcBorders>
+              <w:top w:val="single" w:sz="4" w:color="D9D9D9"/>
+              <w:left w:val="single" w:sz="4" w:color="D9D9D9"/>
+              <w:bottom w:val="single" w:sz="4" w:color="D9D9D9"/>
+              <w:right w:val="single" w:sz="4" w:color="D9D9D9"/>
+            </w:tcBorders>
+          </w:tcPr>
+          <w:p>
+            <w:pPr>
+              <w:spacing w:after="0" w:line="240" w:lineRule="auto"/>
+            </w:pPr>
+            <w:r>
+              <w:rPr>
+                <w:rFonts w:ascii="Arial" w:hAnsi="Arial"/>
+                <w:b w:val="0"/>
+                <w:color w:val="000000"/>
+                <w:sz w:val="16"/>
+              </w:rPr>
+              <w:t>2023-24</w:t>
+            </w:r>
+          </w:p>
+        </w:tc>
+        <w:tc>
+          <w:tcPr>
+            <w:tcW w:type="dxa" w:w="1800"/>
+            <w:vAlign w:val="center"/>
+            <w:tcMar>
+              <w:top w:w="65" w:type="dxa"/>
+              <w:left w:w="85" w:type="dxa"/>
+              <w:bottom w:w="65" w:type="dxa"/>
+              <w:right w:w="85" w:type="dxa"/>
+            </w:tcMar>
+            <w:shd w:fill="FFFFFF"/>
+            <w:tcBorders>
+              <w:top w:val="single" w:sz="4" w:color="D9D9D9"/>
+              <w:left w:val="single" w:sz="4" w:color="D9D9D9"/>
+              <w:bottom w:val="single" w:sz="4" w:color="D9D9D9"/>
+              <w:right w:val="single" w:sz="4" w:color="D9D9D9"/>
+            </w:tcBorders>
+          </w:tcPr>
+          <w:p>
+            <w:pPr>
+              <w:spacing w:after="0" w:line="240" w:lineRule="auto"/>
+            </w:pPr>
+            <w:r>
+              <w:rPr>
+                <w:rFonts w:ascii="Arial" w:hAnsi="Arial"/>
+                <w:b w:val="0"/>
+                <w:color w:val="000000"/>
+                <w:sz w:val="16"/>
+              </w:rPr>
+              <w:t>Training mean</w:t>
+            </w:r>
+          </w:p>
+        </w:tc>
+        <w:tc>
+          <w:tcPr>
+            <w:tcW w:type="dxa" w:w="504"/>
+            <w:vAlign w:val="center"/>
+            <w:tcMar>
+              <w:top w:w="65" w:type="dxa"/>
+              <w:left w:w="85" w:type="dxa"/>
+              <w:bottom w:w="65" w:type="dxa"/>
+              <w:right w:w="85" w:type="dxa"/>
+            </w:tcMar>
+            <w:shd w:fill="FFFFFF"/>
+            <w:tcBorders>
+              <w:top w:val="single" w:sz="4" w:color="D9D9D9"/>
+              <w:left w:val="single" w:sz="4" w:color="D9D9D9"/>
+              <w:bottom w:val="single" w:sz="4" w:color="D9D9D9"/>
+              <w:right w:val="single" w:sz="4" w:color="D9D9D9"/>
+            </w:tcBorders>
+          </w:tcPr>
+          <w:p>
+            <w:pPr>
+              <w:spacing w:after="0" w:line="240" w:lineRule="auto"/>
+              <w:jc w:val="center"/>
+            </w:pPr>
+            <w:r>
+              <w:rPr>
+                <w:rFonts w:ascii="Arial" w:hAnsi="Arial"/>
+                <w:b w:val="0"/>
+                <w:color w:val="000000"/>
+                <w:sz w:val="16"/>
+              </w:rPr>
+              <w:t>80</w:t>
+            </w:r>
+          </w:p>
+        </w:tc>
+        <w:tc>
+          <w:tcPr>
+            <w:tcW w:type="dxa" w:w="3168"/>
+            <w:vAlign w:val="center"/>
+            <w:tcMar>
+              <w:top w:w="65" w:type="dxa"/>
+              <w:left w:w="85" w:type="dxa"/>
+              <w:bottom w:w="65" w:type="dxa"/>
+              <w:right w:w="85" w:type="dxa"/>
+            </w:tcMar>
+            <w:shd w:fill="FFFFFF"/>
+            <w:tcBorders>
+              <w:top w:val="single" w:sz="4" w:color="D9D9D9"/>
+              <w:left w:val="single" w:sz="4" w:color="D9D9D9"/>
+              <w:bottom w:val="single" w:sz="4" w:color="D9D9D9"/>
+              <w:right w:val="single" w:sz="4" w:color="D9D9D9"/>
+            </w:tcBorders>
+          </w:tcPr>
+          <w:p>
+            <w:pPr>
+              <w:spacing w:after="0" w:line="240" w:lineRule="auto"/>
+              <w:jc w:val="center"/>
+            </w:pPr>
+            <w:r>
+              <w:rPr>
+                <w:rFonts w:ascii="Arial" w:hAnsi="Arial"/>
+                <w:b w:val="0"/>
+                <w:color w:val="000000"/>
+                <w:sz w:val="16"/>
+              </w:rPr>
+              <w:t>2.662 / 3.572</w:t>
+            </w:r>
+          </w:p>
+        </w:tc>
+        <w:tc>
+          <w:tcPr>
+            <w:tcW w:type="dxa" w:w="3312"/>
+            <w:vAlign w:val="center"/>
+            <w:tcMar>
+              <w:top w:w="65" w:type="dxa"/>
+              <w:left w:w="85" w:type="dxa"/>
+              <w:bottom w:w="65" w:type="dxa"/>
+              <w:right w:w="85" w:type="dxa"/>
+            </w:tcMar>
+            <w:shd w:fill="FFFFFF"/>
+            <w:tcBorders>
+              <w:top w:val="single" w:sz="4" w:color="D9D9D9"/>
+              <w:left w:val="single" w:sz="4" w:color="D9D9D9"/>
+              <w:bottom w:val="single" w:sz="4" w:color="D9D9D9"/>
+              <w:right w:val="single" w:sz="4" w:color="D9D9D9"/>
+            </w:tcBorders>
+          </w:tcPr>
+          <w:p>
+            <w:pPr>
+              <w:spacing w:after="0" w:line="240" w:lineRule="auto"/>
+              <w:jc w:val="center"/>
+            </w:pPr>
+            <w:r>
+              <w:rPr>
+                <w:rFonts w:ascii="Arial" w:hAnsi="Arial"/>
+                <w:b w:val="0"/>
+                <w:color w:val="000000"/>
+                <w:sz w:val="16"/>
+              </w:rPr>
+              <w:t>2.099 / 2.818</w:t>
+            </w:r>
+          </w:p>
+        </w:tc>
+      </w:tr>
+      <w:tr>
+        <w:trPr>
+          <w:cantSplit/>
+        </w:trPr>
+        <w:tc>
+          <w:tcPr>
+            <w:tcW w:type="dxa" w:w="1584"/>
+            <w:vAlign w:val="center"/>
+            <w:tcMar>
+              <w:top w:w="65" w:type="dxa"/>
+              <w:left w:w="85" w:type="dxa"/>
+              <w:bottom w:w="65" w:type="dxa"/>
+              <w:right w:w="85" w:type="dxa"/>
+            </w:tcMar>
+            <w:shd w:fill="F5F5F5"/>
+            <w:tcBorders>
+              <w:top w:val="single" w:sz="4" w:color="D9D9D9"/>
+              <w:left w:val="single" w:sz="4" w:color="D9D9D9"/>
+              <w:bottom w:val="single" w:sz="4" w:color="D9D9D9"/>
+              <w:right w:val="single" w:sz="4" w:color="D9D9D9"/>
+            </w:tcBorders>
+          </w:tcPr>
+          <w:p>
+            <w:pPr>
+              <w:spacing w:after="0" w:line="240" w:lineRule="auto"/>
+              <w:jc w:val="center"/>
+            </w:pPr>
+            <w:r>
+              <w:rPr>
+                <w:rFonts w:ascii="Arial" w:hAnsi="Arial"/>
+                <w:b w:val="0"/>
+                <w:color w:val="000000"/>
+                <w:sz w:val="16"/>
+              </w:rPr>
+              <w:t>2025</w:t>
+            </w:r>
+          </w:p>
+        </w:tc>
+        <w:tc>
+          <w:tcPr>
+            <w:tcW w:type="dxa" w:w="1800"/>
+            <w:vAlign w:val="center"/>
+            <w:tcMar>
+              <w:top w:w="65" w:type="dxa"/>
+              <w:left w:w="85" w:type="dxa"/>
+              <w:bottom w:w="65" w:type="dxa"/>
+              <w:right w:w="85" w:type="dxa"/>
+            </w:tcMar>
+            <w:shd w:fill="F5F5F5"/>
+            <w:tcBorders>
+              <w:top w:val="single" w:sz="4" w:color="D9D9D9"/>
+              <w:left w:val="single" w:sz="4" w:color="D9D9D9"/>
+              <w:bottom w:val="single" w:sz="4" w:color="D9D9D9"/>
+              <w:right w:val="single" w:sz="4" w:color="D9D9D9"/>
+            </w:tcBorders>
+          </w:tcPr>
+          <w:p>
+            <w:pPr>
+              <w:spacing w:after="0" w:line="240" w:lineRule="auto"/>
+            </w:pPr>
+            <w:r>
+              <w:rPr>
+                <w:rFonts w:ascii="Arial" w:hAnsi="Arial"/>
+                <w:b w:val="0"/>
+                <w:color w:val="000000"/>
+                <w:sz w:val="16"/>
+              </w:rPr>
+              <w:t>OLS</w:t>
+            </w:r>
+          </w:p>
+        </w:tc>
+        <w:tc>
+          <w:tcPr>
+            <w:tcW w:type="dxa" w:w="504"/>
+            <w:vAlign w:val="center"/>
+            <w:tcMar>
+              <w:top w:w="65" w:type="dxa"/>
+              <w:left w:w="85" w:type="dxa"/>
+              <w:bottom w:w="65" w:type="dxa"/>
+              <w:right w:w="85" w:type="dxa"/>
+            </w:tcMar>
+            <w:shd w:fill="F5F5F5"/>
+            <w:tcBorders>
+              <w:top w:val="single" w:sz="4" w:color="D9D9D9"/>
+              <w:left w:val="single" w:sz="4" w:color="D9D9D9"/>
+              <w:bottom w:val="single" w:sz="4" w:color="D9D9D9"/>
+              <w:right w:val="single" w:sz="4" w:color="D9D9D9"/>
+            </w:tcBorders>
+          </w:tcPr>
+          <w:p>
+            <w:pPr>
+              <w:spacing w:after="0" w:line="240" w:lineRule="auto"/>
+              <w:jc w:val="center"/>
+            </w:pPr>
+            <w:r>
+              <w:rPr>
+                <w:rFonts w:ascii="Arial" w:hAnsi="Arial"/>
+                <w:b w:val="0"/>
+                <w:color w:val="000000"/>
+                <w:sz w:val="16"/>
+              </w:rPr>
+              <w:t>40</w:t>
+            </w:r>
+          </w:p>
+        </w:tc>
+        <w:tc>
+          <w:tcPr>
+            <w:tcW w:type="dxa" w:w="3168"/>
+            <w:vAlign w:val="center"/>
+            <w:tcMar>
+              <w:top w:w="65" w:type="dxa"/>
+              <w:left w:w="85" w:type="dxa"/>
+              <w:bottom w:w="65" w:type="dxa"/>
+              <w:right w:w="85" w:type="dxa"/>
+            </w:tcMar>
+            <w:shd w:fill="F5F5F5"/>
+            <w:tcBorders>
+              <w:top w:val="single" w:sz="4" w:color="D9D9D9"/>
+              <w:left w:val="single" w:sz="4" w:color="D9D9D9"/>
+              <w:bottom w:val="single" w:sz="4" w:color="D9D9D9"/>
+              <w:right w:val="single" w:sz="4" w:color="D9D9D9"/>
+            </w:tcBorders>
+          </w:tcPr>
+          <w:p>
+            <w:pPr>
+              <w:spacing w:after="0" w:line="240" w:lineRule="auto"/>
+              <w:jc w:val="center"/>
+            </w:pPr>
+            <w:r>
+              <w:rPr>
+                <w:rFonts w:ascii="Arial" w:hAnsi="Arial"/>
+                <w:b w:val="0"/>
+                <w:color w:val="000000"/>
+                <w:sz w:val="16"/>
+              </w:rPr>
+              <w:t>3.316 / 4.253</w:t>
+            </w:r>
+          </w:p>
+        </w:tc>
+        <w:tc>
+          <w:tcPr>
+            <w:tcW w:type="dxa" w:w="3312"/>
+            <w:vAlign w:val="center"/>
+            <w:tcMar>
+              <w:top w:w="65" w:type="dxa"/>
+              <w:left w:w="85" w:type="dxa"/>
+              <w:bottom w:w="65" w:type="dxa"/>
+              <w:right w:w="85" w:type="dxa"/>
+            </w:tcMar>
+            <w:shd w:fill="F5F5F5"/>
+            <w:tcBorders>
+              <w:top w:val="single" w:sz="4" w:color="D9D9D9"/>
+              <w:left w:val="single" w:sz="4" w:color="D9D9D9"/>
+              <w:bottom w:val="single" w:sz="4" w:color="D9D9D9"/>
+              <w:right w:val="single" w:sz="4" w:color="D9D9D9"/>
+            </w:tcBorders>
+          </w:tcPr>
+          <w:p>
+            <w:pPr>
+              <w:spacing w:after="0" w:line="240" w:lineRule="auto"/>
+              <w:jc w:val="center"/>
+            </w:pPr>
+            <w:r>
+              <w:rPr>
+                <w:rFonts w:ascii="Arial" w:hAnsi="Arial"/>
+                <w:b w:val="0"/>
+                <w:color w:val="000000"/>
+                <w:sz w:val="16"/>
+              </w:rPr>
+              <w:t>2.876 / 3.606</w:t>
+            </w:r>
+          </w:p>
+        </w:tc>
+      </w:tr>
+      <w:tr>
+        <w:trPr>
+          <w:cantSplit/>
+        </w:trPr>
+        <w:tc>
+          <w:tcPr>
+            <w:tcW w:type="dxa" w:w="1584"/>
+            <w:vAlign w:val="center"/>
+            <w:tcMar>
+              <w:top w:w="65" w:type="dxa"/>
+              <w:left w:w="85" w:type="dxa"/>
+              <w:bottom w:w="65" w:type="dxa"/>
+              <w:right w:w="85" w:type="dxa"/>
+            </w:tcMar>
+            <w:shd w:fill="FFFFFF"/>
+            <w:tcBorders>
+              <w:top w:val="single" w:sz="4" w:color="D9D9D9"/>
+              <w:left w:val="single" w:sz="4" w:color="D9D9D9"/>
+              <w:bottom w:val="single" w:sz="4" w:color="D9D9D9"/>
+              <w:right w:val="single" w:sz="4" w:color="D9D9D9"/>
+            </w:tcBorders>
+          </w:tcPr>
+          <w:p>
+            <w:pPr>
+              <w:spacing w:after="0" w:line="240" w:lineRule="auto"/>
+              <w:jc w:val="center"/>
+            </w:pPr>
+            <w:r>
+              <w:rPr>
+                <w:rFonts w:ascii="Arial" w:hAnsi="Arial"/>
+                <w:b w:val="0"/>
+                <w:color w:val="000000"/>
+                <w:sz w:val="16"/>
+              </w:rPr>
+              <w:t>2025</w:t>
+            </w:r>
+          </w:p>
+        </w:tc>
+        <w:tc>
+          <w:tcPr>
+            <w:tcW w:type="dxa" w:w="1800"/>
+            <w:vAlign w:val="center"/>
+            <w:tcMar>
+              <w:top w:w="65" w:type="dxa"/>
+              <w:left w:w="85" w:type="dxa"/>
+              <w:bottom w:w="65" w:type="dxa"/>
+              <w:right w:w="85" w:type="dxa"/>
+            </w:tcMar>
+            <w:shd w:fill="FFFFFF"/>
+            <w:tcBorders>
+              <w:top w:val="single" w:sz="4" w:color="D9D9D9"/>
+              <w:left w:val="single" w:sz="4" w:color="D9D9D9"/>
+              <w:bottom w:val="single" w:sz="4" w:color="D9D9D9"/>
+              <w:right w:val="single" w:sz="4" w:color="D9D9D9"/>
+            </w:tcBorders>
+          </w:tcPr>
+          <w:p>
+            <w:pPr>
+              <w:spacing w:after="0" w:line="240" w:lineRule="auto"/>
+            </w:pPr>
+            <w:r>
+              <w:rPr>
+                <w:rFonts w:ascii="Arial" w:hAnsi="Arial"/>
+                <w:b w:val="0"/>
+                <w:color w:val="000000"/>
+                <w:sz w:val="16"/>
+              </w:rPr>
+              <w:t>Training mean</w:t>
+            </w:r>
+          </w:p>
+        </w:tc>
+        <w:tc>
+          <w:tcPr>
+            <w:tcW w:type="dxa" w:w="504"/>
+            <w:vAlign w:val="center"/>
+            <w:tcMar>
+              <w:top w:w="65" w:type="dxa"/>
+              <w:left w:w="85" w:type="dxa"/>
+              <w:bottom w:w="65" w:type="dxa"/>
+              <w:right w:w="85" w:type="dxa"/>
+            </w:tcMar>
+            <w:shd w:fill="FFFFFF"/>
+            <w:tcBorders>
+              <w:top w:val="single" w:sz="4" w:color="D9D9D9"/>
+              <w:left w:val="single" w:sz="4" w:color="D9D9D9"/>
+              <w:bottom w:val="single" w:sz="4" w:color="D9D9D9"/>
+              <w:right w:val="single" w:sz="4" w:color="D9D9D9"/>
+            </w:tcBorders>
+          </w:tcPr>
+          <w:p>
+            <w:pPr>
+              <w:spacing w:after="0" w:line="240" w:lineRule="auto"/>
+              <w:jc w:val="center"/>
+            </w:pPr>
+            <w:r>
+              <w:rPr>
+                <w:rFonts w:ascii="Arial" w:hAnsi="Arial"/>
+                <w:b w:val="0"/>
+                <w:color w:val="000000"/>
+                <w:sz w:val="16"/>
+              </w:rPr>
+              <w:t>40</w:t>
+            </w:r>
+          </w:p>
+        </w:tc>
+        <w:tc>
+          <w:tcPr>
+            <w:tcW w:type="dxa" w:w="3168"/>
+            <w:vAlign w:val="center"/>
+            <w:tcMar>
+              <w:top w:w="65" w:type="dxa"/>
+              <w:left w:w="85" w:type="dxa"/>
+              <w:bottom w:w="65" w:type="dxa"/>
+              <w:right w:w="85" w:type="dxa"/>
+            </w:tcMar>
+            <w:shd w:fill="FFFFFF"/>
+            <w:tcBorders>
+              <w:top w:val="single" w:sz="4" w:color="D9D9D9"/>
+              <w:left w:val="single" w:sz="4" w:color="D9D9D9"/>
+              <w:bottom w:val="single" w:sz="4" w:color="D9D9D9"/>
+              <w:right w:val="single" w:sz="4" w:color="D9D9D9"/>
+            </w:tcBorders>
+          </w:tcPr>
+          <w:p>
+            <w:pPr>
+              <w:spacing w:after="0" w:line="240" w:lineRule="auto"/>
+              <w:jc w:val="center"/>
+            </w:pPr>
+            <w:r>
+              <w:rPr>
+                <w:rFonts w:ascii="Arial" w:hAnsi="Arial"/>
+                <w:b w:val="0"/>
+                <w:color w:val="000000"/>
+                <w:sz w:val="16"/>
+              </w:rPr>
+              <w:t>3.161 / 4.135</w:t>
+            </w:r>
+          </w:p>
+        </w:tc>
+        <w:tc>
+          <w:tcPr>
+            <w:tcW w:type="dxa" w:w="3312"/>
+            <w:vAlign w:val="center"/>
+            <w:tcMar>
+              <w:top w:w="65" w:type="dxa"/>
+              <w:left w:w="85" w:type="dxa"/>
+              <w:bottom w:w="65" w:type="dxa"/>
+              <w:right w:w="85" w:type="dxa"/>
+            </w:tcMar>
+            <w:shd w:fill="FFFFFF"/>
+            <w:tcBorders>
+              <w:top w:val="single" w:sz="4" w:color="D9D9D9"/>
+              <w:left w:val="single" w:sz="4" w:color="D9D9D9"/>
+              <w:bottom w:val="single" w:sz="4" w:color="D9D9D9"/>
+              <w:right w:val="single" w:sz="4" w:color="D9D9D9"/>
+            </w:tcBorders>
+          </w:tcPr>
+          <w:p>
+            <w:pPr>
+              <w:spacing w:after="0" w:line="240" w:lineRule="auto"/>
+              <w:jc w:val="center"/>
+            </w:pPr>
+            <w:r>
+              <w:rPr>
+                <w:rFonts w:ascii="Arial" w:hAnsi="Arial"/>
+                <w:b w:val="0"/>
+                <w:color w:val="000000"/>
+                <w:sz w:val="16"/>
+              </w:rPr>
+              <w:t>2.974 / 3.651</w:t>
+            </w:r>
+          </w:p>
+        </w:tc>
+      </w:tr>
+    </w:tbl>
+    <w:p>
+      <w:pPr>
+        <w:spacing w:after="20" w:before="0" w:line="40" w:lineRule="exact"/>
+      </w:pPr>
+      <w:r>
+        <w:rPr>
+          <w:sz w:val="4"/>
+        </w:rPr>
+      </w:r>
+    </w:p>
+    <w:p>
+      <w:pPr>
+        <w:pStyle w:val="Caption"/>
+      </w:pPr>
+      <w:r>
+        <w:t>Table 1. OLS does not beat the mean consistently. Raw-return RMSE is worse in both periods; adjusted-return OLS is worse in validation and only slightly better in 2025. Raw direction accuracy is 57.5%/55.0%, versus 57.5%/60.0% for always predicting positive. Zero-forecast results and R-squared are in baseline_metrics.csv.</w:t>
+      </w:r>
+    </w:p>
+    <w:tbl>
+      <w:tblPr>
+        <w:tblW w:type="auto" w:w="0"/>
+        <w:jc w:val="center"/>
+        <w:tblLayout w:type="fixed"/>
+        <w:tblLook w:firstColumn="1" w:firstRow="1" w:lastColumn="0" w:lastRow="0" w:noHBand="0" w:noVBand="1" w:val="04A0"/>
+      </w:tblPr>
+      <w:tblGrid>
+        <w:gridCol w:w="4464"/>
+        <w:gridCol w:w="1152"/>
+        <w:gridCol w:w="2376"/>
+        <w:gridCol w:w="2376"/>
+      </w:tblGrid>
+      <w:tr>
+        <w:trPr>
+          <w:cantSplit/>
+          <w:tblHeader/>
+        </w:trPr>
+        <w:tc>
+          <w:tcPr>
+            <w:tcW w:type="dxa" w:w="4464"/>
+            <w:vAlign w:val="center"/>
+            <w:tcMar>
+              <w:top w:w="65" w:type="dxa"/>
+              <w:left w:w="85" w:type="dxa"/>
+              <w:bottom w:w="65" w:type="dxa"/>
+              <w:right w:w="85" w:type="dxa"/>
+            </w:tcMar>
+            <w:shd w:fill="E0EAF2"/>
+            <w:tcBorders>
+              <w:top w:val="single" w:sz="4" w:color="D9D9D9"/>
+              <w:left w:val="single" w:sz="4" w:color="D9D9D9"/>
+              <w:bottom w:val="single" w:sz="4" w:color="D9D9D9"/>
+              <w:right w:val="single" w:sz="4" w:color="D9D9D9"/>
+            </w:tcBorders>
+          </w:tcPr>
+          <w:p>
+            <w:pPr>
+              <w:spacing w:after="0" w:line="240" w:lineRule="auto"/>
+            </w:pPr>
+            <w:r>
+              <w:rPr>
+                <w:rFonts w:ascii="Arial" w:hAnsi="Arial"/>
+                <w:b/>
+                <w:color w:val="000000"/>
+                <w:sz w:val="16"/>
+              </w:rPr>
+              <w:t>Raw return training treatment</w:t>
+            </w:r>
+          </w:p>
+        </w:tc>
+        <w:tc>
+          <w:tcPr>
+            <w:tcW w:type="dxa" w:w="1152"/>
+            <w:vAlign w:val="center"/>
+            <w:tcMar>
+              <w:top w:w="65" w:type="dxa"/>
+              <w:left w:w="85" w:type="dxa"/>
+              <w:bottom w:w="65" w:type="dxa"/>
+              <w:right w:w="85" w:type="dxa"/>
+            </w:tcMar>
+            <w:shd w:fill="E0EAF2"/>
+            <w:tcBorders>
+              <w:top w:val="single" w:sz="4" w:color="D9D9D9"/>
+              <w:left w:val="single" w:sz="4" w:color="D9D9D9"/>
+              <w:bottom w:val="single" w:sz="4" w:color="D9D9D9"/>
+              <w:right w:val="single" w:sz="4" w:color="D9D9D9"/>
+            </w:tcBorders>
+          </w:tcPr>
+          <w:p>
+            <w:pPr>
+              <w:spacing w:after="0" w:line="240" w:lineRule="auto"/>
+            </w:pPr>
+            <w:r>
+              <w:rPr>
+                <w:rFonts w:ascii="Arial" w:hAnsi="Arial"/>
+                <w:b/>
+                <w:color w:val="000000"/>
+                <w:sz w:val="16"/>
+              </w:rPr>
+              <w:t>Removed</w:t>
+            </w:r>
+          </w:p>
+        </w:tc>
+        <w:tc>
+          <w:tcPr>
+            <w:tcW w:type="dxa" w:w="2376"/>
+            <w:vAlign w:val="center"/>
+            <w:tcMar>
+              <w:top w:w="65" w:type="dxa"/>
+              <w:left w:w="85" w:type="dxa"/>
+              <w:bottom w:w="65" w:type="dxa"/>
+              <w:right w:w="85" w:type="dxa"/>
+            </w:tcMar>
+            <w:shd w:fill="E0EAF2"/>
+            <w:tcBorders>
+              <w:top w:val="single" w:sz="4" w:color="D9D9D9"/>
+              <w:left w:val="single" w:sz="4" w:color="D9D9D9"/>
+              <w:bottom w:val="single" w:sz="4" w:color="D9D9D9"/>
+              <w:right w:val="single" w:sz="4" w:color="D9D9D9"/>
+            </w:tcBorders>
+          </w:tcPr>
+          <w:p>
+            <w:pPr>
+              <w:spacing w:after="0" w:line="240" w:lineRule="auto"/>
+              <w:jc w:val="center"/>
+            </w:pPr>
+            <w:r>
+              <w:rPr>
+                <w:rFonts w:ascii="Arial" w:hAnsi="Arial"/>
+                <w:b/>
+                <w:color w:val="000000"/>
+                <w:sz w:val="16"/>
+              </w:rPr>
+              <w:t>Validation RMSE (pp)</w:t>
+            </w:r>
+          </w:p>
+        </w:tc>
+        <w:tc>
+          <w:tcPr>
+            <w:tcW w:type="dxa" w:w="2376"/>
+            <w:vAlign w:val="center"/>
+            <w:tcMar>
+              <w:top w:w="65" w:type="dxa"/>
+              <w:left w:w="85" w:type="dxa"/>
+              <w:bottom w:w="65" w:type="dxa"/>
+              <w:right w:w="85" w:type="dxa"/>
+            </w:tcMar>
+            <w:shd w:fill="E0EAF2"/>
+            <w:tcBorders>
+              <w:top w:val="single" w:sz="4" w:color="D9D9D9"/>
+              <w:left w:val="single" w:sz="4" w:color="D9D9D9"/>
+              <w:bottom w:val="single" w:sz="4" w:color="D9D9D9"/>
+              <w:right w:val="single" w:sz="4" w:color="D9D9D9"/>
+            </w:tcBorders>
+          </w:tcPr>
+          <w:p>
+            <w:pPr>
+              <w:spacing w:after="0" w:line="240" w:lineRule="auto"/>
+              <w:jc w:val="center"/>
+            </w:pPr>
+            <w:r>
+              <w:rPr>
+                <w:rFonts w:ascii="Arial" w:hAnsi="Arial"/>
+                <w:b/>
+                <w:color w:val="000000"/>
+                <w:sz w:val="16"/>
+              </w:rPr>
+              <w:t>2025 RMSE (pp)</w:t>
+            </w:r>
+          </w:p>
+        </w:tc>
+      </w:tr>
+      <w:tr>
+        <w:trPr>
+          <w:cantSplit/>
+        </w:trPr>
+        <w:tc>
+          <w:tcPr>
+            <w:tcW w:type="dxa" w:w="4464"/>
+            <w:vAlign w:val="center"/>
+            <w:tcMar>
+              <w:top w:w="65" w:type="dxa"/>
+              <w:left w:w="85" w:type="dxa"/>
+              <w:bottom w:w="65" w:type="dxa"/>
+              <w:right w:w="85" w:type="dxa"/>
+            </w:tcMar>
+            <w:shd w:fill="F5F5F5"/>
+            <w:tcBorders>
+              <w:top w:val="single" w:sz="4" w:color="D9D9D9"/>
+              <w:left w:val="single" w:sz="4" w:color="D9D9D9"/>
+              <w:bottom w:val="single" w:sz="4" w:color="D9D9D9"/>
+              <w:right w:val="single" w:sz="4" w:color="D9D9D9"/>
+            </w:tcBorders>
+          </w:tcPr>
+          <w:p>
+            <w:pPr>
+              <w:spacing w:after="0" w:line="240" w:lineRule="auto"/>
+            </w:pPr>
+            <w:r>
+              <w:rPr>
+                <w:rFonts w:ascii="Arial" w:hAnsi="Arial"/>
+                <w:b w:val="0"/>
+                <w:color w:val="000000"/>
+                <w:sz w:val="16"/>
+              </w:rPr>
+              <w:t>Original OLS</w:t>
+            </w:r>
+          </w:p>
+        </w:tc>
+        <w:tc>
+          <w:tcPr>
+            <w:tcW w:type="dxa" w:w="1152"/>
+            <w:vAlign w:val="center"/>
+            <w:tcMar>
+              <w:top w:w="65" w:type="dxa"/>
+              <w:left w:w="85" w:type="dxa"/>
+              <w:bottom w:w="65" w:type="dxa"/>
+              <w:right w:w="85" w:type="dxa"/>
+            </w:tcMar>
+            <w:shd w:fill="F5F5F5"/>
+            <w:tcBorders>
+              <w:top w:val="single" w:sz="4" w:color="D9D9D9"/>
+              <w:left w:val="single" w:sz="4" w:color="D9D9D9"/>
+              <w:bottom w:val="single" w:sz="4" w:color="D9D9D9"/>
+              <w:right w:val="single" w:sz="4" w:color="D9D9D9"/>
+            </w:tcBorders>
+          </w:tcPr>
+          <w:p>
+            <w:pPr>
+              <w:spacing w:after="0" w:line="240" w:lineRule="auto"/>
+              <w:jc w:val="center"/>
+            </w:pPr>
+            <w:r>
+              <w:rPr>
+                <w:rFonts w:ascii="Arial" w:hAnsi="Arial"/>
+                <w:b w:val="0"/>
+                <w:color w:val="000000"/>
+                <w:sz w:val="16"/>
+              </w:rPr>
+              <w:t>0</w:t>
+            </w:r>
+          </w:p>
+        </w:tc>
+        <w:tc>
+          <w:tcPr>
+            <w:tcW w:type="dxa" w:w="2376"/>
             <w:vAlign w:val="center"/>
             <w:tcMar>
               <w:top w:w="65" w:type="dxa"/>
@@ -1018,387 +1768,7 @@
         </w:tc>
         <w:tc>
           <w:tcPr>
-            <w:tcW w:type="dxa" w:w="1800"/>
-            <w:vAlign w:val="center"/>
-            <w:tcMar>
-              <w:top w:w="65" w:type="dxa"/>
-              <w:left w:w="85" w:type="dxa"/>
-              <w:bottom w:w="65" w:type="dxa"/>
-              <w:right w:w="85" w:type="dxa"/>
-            </w:tcMar>
-            <w:shd w:fill="F5F5F5"/>
-            <w:tcBorders>
-              <w:top w:val="single" w:sz="4" w:color="D9D9D9"/>
-              <w:left w:val="single" w:sz="4" w:color="D9D9D9"/>
-              <w:bottom w:val="single" w:sz="4" w:color="D9D9D9"/>
-              <w:right w:val="single" w:sz="4" w:color="D9D9D9"/>
-            </w:tcBorders>
-          </w:tcPr>
-          <w:p>
-            <w:pPr>
-              <w:spacing w:after="0" w:line="240" w:lineRule="auto"/>
-              <w:jc w:val="center"/>
-            </w:pPr>
-            <w:r>
-              <w:rPr>
-                <w:rFonts w:ascii="Arial" w:hAnsi="Arial"/>
-                <w:b w:val="0"/>
-                <w:color w:val="000000"/>
-                <w:sz w:val="16"/>
-              </w:rPr>
-              <w:t>-0.160</w:t>
-            </w:r>
-          </w:p>
-        </w:tc>
-      </w:tr>
-      <w:tr>
-        <w:trPr>
-          <w:cantSplit/>
-        </w:trPr>
-        <w:tc>
-          <w:tcPr>
-            <w:tcW w:type="dxa" w:w="2520"/>
-            <w:vAlign w:val="center"/>
-            <w:tcMar>
-              <w:top w:w="65" w:type="dxa"/>
-              <w:left w:w="85" w:type="dxa"/>
-              <w:bottom w:w="65" w:type="dxa"/>
-              <w:right w:w="85" w:type="dxa"/>
-            </w:tcMar>
-            <w:shd w:fill="FFFFFF"/>
-            <w:tcBorders>
-              <w:top w:val="single" w:sz="4" w:color="D9D9D9"/>
-              <w:left w:val="single" w:sz="4" w:color="D9D9D9"/>
-              <w:bottom w:val="single" w:sz="4" w:color="D9D9D9"/>
-              <w:right w:val="single" w:sz="4" w:color="D9D9D9"/>
-            </w:tcBorders>
-          </w:tcPr>
-          <w:p>
-            <w:pPr>
-              <w:spacing w:after="0" w:line="240" w:lineRule="auto"/>
-            </w:pPr>
-            <w:r>
-              <w:rPr>
-                <w:rFonts w:ascii="Arial" w:hAnsi="Arial"/>
-                <w:b w:val="0"/>
-                <w:color w:val="000000"/>
-                <w:sz w:val="16"/>
-              </w:rPr>
-              <w:t>Raw / 2023-24</w:t>
-            </w:r>
-          </w:p>
-        </w:tc>
-        <w:tc>
-          <w:tcPr>
-            <w:tcW w:type="dxa" w:w="1872"/>
-            <w:vAlign w:val="center"/>
-            <w:tcMar>
-              <w:top w:w="65" w:type="dxa"/>
-              <w:left w:w="85" w:type="dxa"/>
-              <w:bottom w:w="65" w:type="dxa"/>
-              <w:right w:w="85" w:type="dxa"/>
-            </w:tcMar>
-            <w:shd w:fill="FFFFFF"/>
-            <w:tcBorders>
-              <w:top w:val="single" w:sz="4" w:color="D9D9D9"/>
-              <w:left w:val="single" w:sz="4" w:color="D9D9D9"/>
-              <w:bottom w:val="single" w:sz="4" w:color="D9D9D9"/>
-              <w:right w:val="single" w:sz="4" w:color="D9D9D9"/>
-            </w:tcBorders>
-          </w:tcPr>
-          <w:p>
-            <w:pPr>
-              <w:spacing w:after="0" w:line="240" w:lineRule="auto"/>
-            </w:pPr>
-            <w:r>
-              <w:rPr>
-                <w:rFonts w:ascii="Arial" w:hAnsi="Arial"/>
-                <w:b w:val="0"/>
-                <w:color w:val="000000"/>
-                <w:sz w:val="16"/>
-              </w:rPr>
-              <w:t>Training mean</w:t>
-            </w:r>
-          </w:p>
-        </w:tc>
-        <w:tc>
-          <w:tcPr>
-            <w:tcW w:type="dxa" w:w="576"/>
-            <w:vAlign w:val="center"/>
-            <w:tcMar>
-              <w:top w:w="65" w:type="dxa"/>
-              <w:left w:w="85" w:type="dxa"/>
-              <w:bottom w:w="65" w:type="dxa"/>
-              <w:right w:w="85" w:type="dxa"/>
-            </w:tcMar>
-            <w:shd w:fill="FFFFFF"/>
-            <w:tcBorders>
-              <w:top w:val="single" w:sz="4" w:color="D9D9D9"/>
-              <w:left w:val="single" w:sz="4" w:color="D9D9D9"/>
-              <w:bottom w:val="single" w:sz="4" w:color="D9D9D9"/>
-              <w:right w:val="single" w:sz="4" w:color="D9D9D9"/>
-            </w:tcBorders>
-          </w:tcPr>
-          <w:p>
-            <w:pPr>
-              <w:spacing w:after="0" w:line="240" w:lineRule="auto"/>
-              <w:jc w:val="center"/>
-            </w:pPr>
-            <w:r>
-              <w:rPr>
-                <w:rFonts w:ascii="Arial" w:hAnsi="Arial"/>
-                <w:b w:val="0"/>
-                <w:color w:val="000000"/>
-                <w:sz w:val="16"/>
-              </w:rPr>
-              <w:t>80</w:t>
-            </w:r>
-          </w:p>
-        </w:tc>
-        <w:tc>
-          <w:tcPr>
-            <w:tcW w:type="dxa" w:w="1728"/>
-            <w:vAlign w:val="center"/>
-            <w:tcMar>
-              <w:top w:w="65" w:type="dxa"/>
-              <w:left w:w="85" w:type="dxa"/>
-              <w:bottom w:w="65" w:type="dxa"/>
-              <w:right w:w="85" w:type="dxa"/>
-            </w:tcMar>
-            <w:shd w:fill="FFFFFF"/>
-            <w:tcBorders>
-              <w:top w:val="single" w:sz="4" w:color="D9D9D9"/>
-              <w:left w:val="single" w:sz="4" w:color="D9D9D9"/>
-              <w:bottom w:val="single" w:sz="4" w:color="D9D9D9"/>
-              <w:right w:val="single" w:sz="4" w:color="D9D9D9"/>
-            </w:tcBorders>
-          </w:tcPr>
-          <w:p>
-            <w:pPr>
-              <w:spacing w:after="0" w:line="240" w:lineRule="auto"/>
-              <w:jc w:val="center"/>
-            </w:pPr>
-            <w:r>
-              <w:rPr>
-                <w:rFonts w:ascii="Arial" w:hAnsi="Arial"/>
-                <w:b w:val="0"/>
-                <w:color w:val="000000"/>
-                <w:sz w:val="16"/>
-              </w:rPr>
-              <w:t>2.662</w:t>
-            </w:r>
-          </w:p>
-        </w:tc>
-        <w:tc>
-          <w:tcPr>
-            <w:tcW w:type="dxa" w:w="1872"/>
-            <w:vAlign w:val="center"/>
-            <w:tcMar>
-              <w:top w:w="65" w:type="dxa"/>
-              <w:left w:w="85" w:type="dxa"/>
-              <w:bottom w:w="65" w:type="dxa"/>
-              <w:right w:w="85" w:type="dxa"/>
-            </w:tcMar>
-            <w:shd w:fill="FFFFFF"/>
-            <w:tcBorders>
-              <w:top w:val="single" w:sz="4" w:color="D9D9D9"/>
-              <w:left w:val="single" w:sz="4" w:color="D9D9D9"/>
-              <w:bottom w:val="single" w:sz="4" w:color="D9D9D9"/>
-              <w:right w:val="single" w:sz="4" w:color="D9D9D9"/>
-            </w:tcBorders>
-          </w:tcPr>
-          <w:p>
-            <w:pPr>
-              <w:spacing w:after="0" w:line="240" w:lineRule="auto"/>
-              <w:jc w:val="center"/>
-            </w:pPr>
-            <w:r>
-              <w:rPr>
-                <w:rFonts w:ascii="Arial" w:hAnsi="Arial"/>
-                <w:b w:val="0"/>
-                <w:color w:val="000000"/>
-                <w:sz w:val="16"/>
-              </w:rPr>
-              <w:t>3.572</w:t>
-            </w:r>
-          </w:p>
-        </w:tc>
-        <w:tc>
-          <w:tcPr>
-            <w:tcW w:type="dxa" w:w="1800"/>
-            <w:vAlign w:val="center"/>
-            <w:tcMar>
-              <w:top w:w="65" w:type="dxa"/>
-              <w:left w:w="85" w:type="dxa"/>
-              <w:bottom w:w="65" w:type="dxa"/>
-              <w:right w:w="85" w:type="dxa"/>
-            </w:tcMar>
-            <w:shd w:fill="FFFFFF"/>
-            <w:tcBorders>
-              <w:top w:val="single" w:sz="4" w:color="D9D9D9"/>
-              <w:left w:val="single" w:sz="4" w:color="D9D9D9"/>
-              <w:bottom w:val="single" w:sz="4" w:color="D9D9D9"/>
-              <w:right w:val="single" w:sz="4" w:color="D9D9D9"/>
-            </w:tcBorders>
-          </w:tcPr>
-          <w:p>
-            <w:pPr>
-              <w:spacing w:after="0" w:line="240" w:lineRule="auto"/>
-              <w:jc w:val="center"/>
-            </w:pPr>
-            <w:r>
-              <w:rPr>
-                <w:rFonts w:ascii="Arial" w:hAnsi="Arial"/>
-                <w:b w:val="0"/>
-                <w:color w:val="000000"/>
-                <w:sz w:val="16"/>
-              </w:rPr>
-              <w:t>-0.005</w:t>
-            </w:r>
-          </w:p>
-        </w:tc>
-      </w:tr>
-      <w:tr>
-        <w:trPr>
-          <w:cantSplit/>
-        </w:trPr>
-        <w:tc>
-          <w:tcPr>
-            <w:tcW w:type="dxa" w:w="2520"/>
-            <w:vAlign w:val="center"/>
-            <w:tcMar>
-              <w:top w:w="65" w:type="dxa"/>
-              <w:left w:w="85" w:type="dxa"/>
-              <w:bottom w:w="65" w:type="dxa"/>
-              <w:right w:w="85" w:type="dxa"/>
-            </w:tcMar>
-            <w:shd w:fill="F5F5F5"/>
-            <w:tcBorders>
-              <w:top w:val="single" w:sz="4" w:color="D9D9D9"/>
-              <w:left w:val="single" w:sz="4" w:color="D9D9D9"/>
-              <w:bottom w:val="single" w:sz="4" w:color="D9D9D9"/>
-              <w:right w:val="single" w:sz="4" w:color="D9D9D9"/>
-            </w:tcBorders>
-          </w:tcPr>
-          <w:p>
-            <w:pPr>
-              <w:spacing w:after="0" w:line="240" w:lineRule="auto"/>
-            </w:pPr>
-            <w:r>
-              <w:rPr>
-                <w:rFonts w:ascii="Arial" w:hAnsi="Arial"/>
-                <w:b w:val="0"/>
-                <w:color w:val="000000"/>
-                <w:sz w:val="16"/>
-              </w:rPr>
-              <w:t>Raw / 2025</w:t>
-            </w:r>
-          </w:p>
-        </w:tc>
-        <w:tc>
-          <w:tcPr>
-            <w:tcW w:type="dxa" w:w="1872"/>
-            <w:vAlign w:val="center"/>
-            <w:tcMar>
-              <w:top w:w="65" w:type="dxa"/>
-              <w:left w:w="85" w:type="dxa"/>
-              <w:bottom w:w="65" w:type="dxa"/>
-              <w:right w:w="85" w:type="dxa"/>
-            </w:tcMar>
-            <w:shd w:fill="F5F5F5"/>
-            <w:tcBorders>
-              <w:top w:val="single" w:sz="4" w:color="D9D9D9"/>
-              <w:left w:val="single" w:sz="4" w:color="D9D9D9"/>
-              <w:bottom w:val="single" w:sz="4" w:color="D9D9D9"/>
-              <w:right w:val="single" w:sz="4" w:color="D9D9D9"/>
-            </w:tcBorders>
-          </w:tcPr>
-          <w:p>
-            <w:pPr>
-              <w:spacing w:after="0" w:line="240" w:lineRule="auto"/>
-            </w:pPr>
-            <w:r>
-              <w:rPr>
-                <w:rFonts w:ascii="Arial" w:hAnsi="Arial"/>
-                <w:b w:val="0"/>
-                <w:color w:val="000000"/>
-                <w:sz w:val="16"/>
-              </w:rPr>
-              <w:t>OLS</w:t>
-            </w:r>
-          </w:p>
-        </w:tc>
-        <w:tc>
-          <w:tcPr>
-            <w:tcW w:type="dxa" w:w="576"/>
-            <w:vAlign w:val="center"/>
-            <w:tcMar>
-              <w:top w:w="65" w:type="dxa"/>
-              <w:left w:w="85" w:type="dxa"/>
-              <w:bottom w:w="65" w:type="dxa"/>
-              <w:right w:w="85" w:type="dxa"/>
-            </w:tcMar>
-            <w:shd w:fill="F5F5F5"/>
-            <w:tcBorders>
-              <w:top w:val="single" w:sz="4" w:color="D9D9D9"/>
-              <w:left w:val="single" w:sz="4" w:color="D9D9D9"/>
-              <w:bottom w:val="single" w:sz="4" w:color="D9D9D9"/>
-              <w:right w:val="single" w:sz="4" w:color="D9D9D9"/>
-            </w:tcBorders>
-          </w:tcPr>
-          <w:p>
-            <w:pPr>
-              <w:spacing w:after="0" w:line="240" w:lineRule="auto"/>
-              <w:jc w:val="center"/>
-            </w:pPr>
-            <w:r>
-              <w:rPr>
-                <w:rFonts w:ascii="Arial" w:hAnsi="Arial"/>
-                <w:b w:val="0"/>
-                <w:color w:val="000000"/>
-                <w:sz w:val="16"/>
-              </w:rPr>
-              <w:t>40</w:t>
-            </w:r>
-          </w:p>
-        </w:tc>
-        <w:tc>
-          <w:tcPr>
-            <w:tcW w:type="dxa" w:w="1728"/>
-            <w:vAlign w:val="center"/>
-            <w:tcMar>
-              <w:top w:w="65" w:type="dxa"/>
-              <w:left w:w="85" w:type="dxa"/>
-              <w:bottom w:w="65" w:type="dxa"/>
-              <w:right w:w="85" w:type="dxa"/>
-            </w:tcMar>
-            <w:shd w:fill="F5F5F5"/>
-            <w:tcBorders>
-              <w:top w:val="single" w:sz="4" w:color="D9D9D9"/>
-              <w:left w:val="single" w:sz="4" w:color="D9D9D9"/>
-              <w:bottom w:val="single" w:sz="4" w:color="D9D9D9"/>
-              <w:right w:val="single" w:sz="4" w:color="D9D9D9"/>
-            </w:tcBorders>
-          </w:tcPr>
-          <w:p>
-            <w:pPr>
-              <w:spacing w:after="0" w:line="240" w:lineRule="auto"/>
-              <w:jc w:val="center"/>
-            </w:pPr>
-            <w:r>
-              <w:rPr>
-                <w:rFonts w:ascii="Arial" w:hAnsi="Arial"/>
-                <w:b w:val="0"/>
-                <w:color w:val="000000"/>
-                <w:sz w:val="16"/>
-              </w:rPr>
-              <w:t>3.316</w:t>
-            </w:r>
-          </w:p>
-        </w:tc>
-        <w:tc>
-          <w:tcPr>
-            <w:tcW w:type="dxa" w:w="1872"/>
+            <w:tcW w:type="dxa" w:w="2376"/>
             <w:vAlign w:val="center"/>
             <w:tcMar>
               <w:top w:w="65" w:type="dxa"/>
@@ -1430,9 +1800,187 @@
             </w:r>
           </w:p>
         </w:tc>
+      </w:tr>
+      <w:tr>
+        <w:trPr>
+          <w:cantSplit/>
+        </w:trPr>
         <w:tc>
           <w:tcPr>
-            <w:tcW w:type="dxa" w:w="1800"/>
+            <w:tcW w:type="dxa" w:w="4464"/>
+            <w:vAlign w:val="center"/>
+            <w:tcMar>
+              <w:top w:w="65" w:type="dxa"/>
+              <w:left w:w="85" w:type="dxa"/>
+              <w:bottom w:w="65" w:type="dxa"/>
+              <w:right w:w="85" w:type="dxa"/>
+            </w:tcMar>
+            <w:shd w:fill="FFFFFF"/>
+            <w:tcBorders>
+              <w:top w:val="single" w:sz="4" w:color="D9D9D9"/>
+              <w:left w:val="single" w:sz="4" w:color="D9D9D9"/>
+              <w:bottom w:val="single" w:sz="4" w:color="D9D9D9"/>
+              <w:right w:val="single" w:sz="4" w:color="D9D9D9"/>
+            </w:tcBorders>
+          </w:tcPr>
+          <w:p>
+            <w:pPr>
+              <w:spacing w:after="0" w:line="240" w:lineRule="auto"/>
+            </w:pPr>
+            <w:r>
+              <w:rPr>
+                <w:rFonts w:ascii="Arial" w:hAnsi="Arial"/>
+                <w:b w:val="0"/>
+                <w:color w:val="000000"/>
+                <w:sz w:val="16"/>
+              </w:rPr>
+              <w:t>Exclude surprise over 100%</w:t>
+            </w:r>
+          </w:p>
+        </w:tc>
+        <w:tc>
+          <w:tcPr>
+            <w:tcW w:type="dxa" w:w="1152"/>
+            <w:vAlign w:val="center"/>
+            <w:tcMar>
+              <w:top w:w="65" w:type="dxa"/>
+              <w:left w:w="85" w:type="dxa"/>
+              <w:bottom w:w="65" w:type="dxa"/>
+              <w:right w:w="85" w:type="dxa"/>
+            </w:tcMar>
+            <w:shd w:fill="FFFFFF"/>
+            <w:tcBorders>
+              <w:top w:val="single" w:sz="4" w:color="D9D9D9"/>
+              <w:left w:val="single" w:sz="4" w:color="D9D9D9"/>
+              <w:bottom w:val="single" w:sz="4" w:color="D9D9D9"/>
+              <w:right w:val="single" w:sz="4" w:color="D9D9D9"/>
+            </w:tcBorders>
+          </w:tcPr>
+          <w:p>
+            <w:pPr>
+              <w:spacing w:after="0" w:line="240" w:lineRule="auto"/>
+              <w:jc w:val="center"/>
+            </w:pPr>
+            <w:r>
+              <w:rPr>
+                <w:rFonts w:ascii="Arial" w:hAnsi="Arial"/>
+                <w:b w:val="0"/>
+                <w:color w:val="000000"/>
+                <w:sz w:val="16"/>
+              </w:rPr>
+              <w:t>7</w:t>
+            </w:r>
+          </w:p>
+        </w:tc>
+        <w:tc>
+          <w:tcPr>
+            <w:tcW w:type="dxa" w:w="2376"/>
+            <w:vAlign w:val="center"/>
+            <w:tcMar>
+              <w:top w:w="65" w:type="dxa"/>
+              <w:left w:w="85" w:type="dxa"/>
+              <w:bottom w:w="65" w:type="dxa"/>
+              <w:right w:w="85" w:type="dxa"/>
+            </w:tcMar>
+            <w:shd w:fill="FFFFFF"/>
+            <w:tcBorders>
+              <w:top w:val="single" w:sz="4" w:color="D9D9D9"/>
+              <w:left w:val="single" w:sz="4" w:color="D9D9D9"/>
+              <w:bottom w:val="single" w:sz="4" w:color="D9D9D9"/>
+              <w:right w:val="single" w:sz="4" w:color="D9D9D9"/>
+            </w:tcBorders>
+          </w:tcPr>
+          <w:p>
+            <w:pPr>
+              <w:spacing w:after="0" w:line="240" w:lineRule="auto"/>
+              <w:jc w:val="center"/>
+            </w:pPr>
+            <w:r>
+              <w:rPr>
+                <w:rFonts w:ascii="Arial" w:hAnsi="Arial"/>
+                <w:b w:val="0"/>
+                <w:color w:val="000000"/>
+                <w:sz w:val="16"/>
+              </w:rPr>
+              <w:t>3.733</w:t>
+            </w:r>
+          </w:p>
+        </w:tc>
+        <w:tc>
+          <w:tcPr>
+            <w:tcW w:type="dxa" w:w="2376"/>
+            <w:vAlign w:val="center"/>
+            <w:tcMar>
+              <w:top w:w="65" w:type="dxa"/>
+              <w:left w:w="85" w:type="dxa"/>
+              <w:bottom w:w="65" w:type="dxa"/>
+              <w:right w:w="85" w:type="dxa"/>
+            </w:tcMar>
+            <w:shd w:fill="FFFFFF"/>
+            <w:tcBorders>
+              <w:top w:val="single" w:sz="4" w:color="D9D9D9"/>
+              <w:left w:val="single" w:sz="4" w:color="D9D9D9"/>
+              <w:bottom w:val="single" w:sz="4" w:color="D9D9D9"/>
+              <w:right w:val="single" w:sz="4" w:color="D9D9D9"/>
+            </w:tcBorders>
+          </w:tcPr>
+          <w:p>
+            <w:pPr>
+              <w:spacing w:after="0" w:line="240" w:lineRule="auto"/>
+              <w:jc w:val="center"/>
+            </w:pPr>
+            <w:r>
+              <w:rPr>
+                <w:rFonts w:ascii="Arial" w:hAnsi="Arial"/>
+                <w:b w:val="0"/>
+                <w:color w:val="000000"/>
+                <w:sz w:val="16"/>
+              </w:rPr>
+              <w:t>4.288</w:t>
+            </w:r>
+          </w:p>
+        </w:tc>
+      </w:tr>
+      <w:tr>
+        <w:trPr>
+          <w:cantSplit/>
+        </w:trPr>
+        <w:tc>
+          <w:tcPr>
+            <w:tcW w:type="dxa" w:w="4464"/>
+            <w:vAlign w:val="center"/>
+            <w:tcMar>
+              <w:top w:w="65" w:type="dxa"/>
+              <w:left w:w="85" w:type="dxa"/>
+              <w:bottom w:w="65" w:type="dxa"/>
+              <w:right w:w="85" w:type="dxa"/>
+            </w:tcMar>
+            <w:shd w:fill="F5F5F5"/>
+            <w:tcBorders>
+              <w:top w:val="single" w:sz="4" w:color="D9D9D9"/>
+              <w:left w:val="single" w:sz="4" w:color="D9D9D9"/>
+              <w:bottom w:val="single" w:sz="4" w:color="D9D9D9"/>
+              <w:right w:val="single" w:sz="4" w:color="D9D9D9"/>
+            </w:tcBorders>
+          </w:tcPr>
+          <w:p>
+            <w:pPr>
+              <w:spacing w:after="0" w:line="240" w:lineRule="auto"/>
+            </w:pPr>
+            <w:r>
+              <w:rPr>
+                <w:rFonts w:ascii="Arial" w:hAnsi="Arial"/>
+                <w:b w:val="0"/>
+                <w:color w:val="000000"/>
+                <w:sz w:val="16"/>
+              </w:rPr>
+              <w:t>Exclude influential training events</w:t>
+            </w:r>
+          </w:p>
+        </w:tc>
+        <w:tc>
+          <w:tcPr>
+            <w:tcW w:type="dxa" w:w="1152"/>
             <w:vAlign w:val="center"/>
             <w:tcMar>
               <w:top w:w="65" w:type="dxa"/>
@@ -1460,7 +2008,75 @@
                 <w:color w:val="000000"/>
                 <w:sz w:val="16"/>
               </w:rPr>
-              <w:t>-0.068</w:t>
+              <w:t>17</w:t>
+            </w:r>
+          </w:p>
+        </w:tc>
+        <w:tc>
+          <w:tcPr>
+            <w:tcW w:type="dxa" w:w="2376"/>
+            <w:vAlign w:val="center"/>
+            <w:tcMar>
+              <w:top w:w="65" w:type="dxa"/>
+              <w:left w:w="85" w:type="dxa"/>
+              <w:bottom w:w="65" w:type="dxa"/>
+              <w:right w:w="85" w:type="dxa"/>
+            </w:tcMar>
+            <w:shd w:fill="F5F5F5"/>
+            <w:tcBorders>
+              <w:top w:val="single" w:sz="4" w:color="D9D9D9"/>
+              <w:left w:val="single" w:sz="4" w:color="D9D9D9"/>
+              <w:bottom w:val="single" w:sz="4" w:color="D9D9D9"/>
+              <w:right w:val="single" w:sz="4" w:color="D9D9D9"/>
+            </w:tcBorders>
+          </w:tcPr>
+          <w:p>
+            <w:pPr>
+              <w:spacing w:after="0" w:line="240" w:lineRule="auto"/>
+              <w:jc w:val="center"/>
+            </w:pPr>
+            <w:r>
+              <w:rPr>
+                <w:rFonts w:ascii="Arial" w:hAnsi="Arial"/>
+                <w:b w:val="0"/>
+                <w:color w:val="000000"/>
+                <w:sz w:val="16"/>
+              </w:rPr>
+              <w:t>3.898</w:t>
+            </w:r>
+          </w:p>
+        </w:tc>
+        <w:tc>
+          <w:tcPr>
+            <w:tcW w:type="dxa" w:w="2376"/>
+            <w:vAlign w:val="center"/>
+            <w:tcMar>
+              <w:top w:w="65" w:type="dxa"/>
+              <w:left w:w="85" w:type="dxa"/>
+              <w:bottom w:w="65" w:type="dxa"/>
+              <w:right w:w="85" w:type="dxa"/>
+            </w:tcMar>
+            <w:shd w:fill="F5F5F5"/>
+            <w:tcBorders>
+              <w:top w:val="single" w:sz="4" w:color="D9D9D9"/>
+              <w:left w:val="single" w:sz="4" w:color="D9D9D9"/>
+              <w:bottom w:val="single" w:sz="4" w:color="D9D9D9"/>
+              <w:right w:val="single" w:sz="4" w:color="D9D9D9"/>
+            </w:tcBorders>
+          </w:tcPr>
+          <w:p>
+            <w:pPr>
+              <w:spacing w:after="0" w:line="240" w:lineRule="auto"/>
+              <w:jc w:val="center"/>
+            </w:pPr>
+            <w:r>
+              <w:rPr>
+                <w:rFonts w:ascii="Arial" w:hAnsi="Arial"/>
+                <w:b w:val="0"/>
+                <w:color w:val="000000"/>
+                <w:sz w:val="16"/>
+              </w:rPr>
+              <w:t>4.108</w:t>
             </w:r>
           </w:p>
         </w:tc>
@@ -1471,7 +2087,7 @@
         </w:trPr>
         <w:tc>
           <w:tcPr>
-            <w:tcW w:type="dxa" w:w="2520"/>
+            <w:tcW w:type="dxa" w:w="4464"/>
             <w:vAlign w:val="center"/>
             <w:tcMar>
               <w:top w:w="65" w:type="dxa"/>
@@ -1498,46 +2114,13 @@
                 <w:color w:val="000000"/>
                 <w:sz w:val="16"/>
               </w:rPr>
-              <w:t>Raw / 2025</w:t>
+              <w:t>Clip surprise to training 1st/99th percentiles</w:t>
             </w:r>
           </w:p>
         </w:tc>
         <w:tc>
           <w:tcPr>
-            <w:tcW w:type="dxa" w:w="1872"/>
-            <w:vAlign w:val="center"/>
-            <w:tcMar>
-              <w:top w:w="65" w:type="dxa"/>
-              <w:left w:w="85" w:type="dxa"/>
-              <w:bottom w:w="65" w:type="dxa"/>
-              <w:right w:w="85" w:type="dxa"/>
-            </w:tcMar>
-            <w:shd w:fill="FFFFFF"/>
-            <w:tcBorders>
-              <w:top w:val="single" w:sz="4" w:color="D9D9D9"/>
-              <w:left w:val="single" w:sz="4" w:color="D9D9D9"/>
-              <w:bottom w:val="single" w:sz="4" w:color="D9D9D9"/>
-              <w:right w:val="single" w:sz="4" w:color="D9D9D9"/>
-            </w:tcBorders>
-          </w:tcPr>
-          <w:p>
-            <w:pPr>
-              <w:spacing w:after="0" w:line="240" w:lineRule="auto"/>
-            </w:pPr>
-            <w:r>
-              <w:rPr>
-                <w:rFonts w:ascii="Arial" w:hAnsi="Arial"/>
-                <w:b w:val="0"/>
-                <w:color w:val="000000"/>
-                <w:sz w:val="16"/>
-              </w:rPr>
-              <w:t>Training mean</w:t>
-            </w:r>
-          </w:p>
-        </w:tc>
-        <w:tc>
-          <w:tcPr>
-            <w:tcW w:type="dxa" w:w="576"/>
+            <w:tcW w:type="dxa" w:w="1152"/>
             <w:vAlign w:val="center"/>
             <w:tcMar>
               <w:top w:w="65" w:type="dxa"/>
@@ -1565,13 +2148,13 @@
                 <w:color w:val="000000"/>
                 <w:sz w:val="16"/>
               </w:rPr>
-              <w:t>40</w:t>
+              <w:t>0</w:t>
             </w:r>
           </w:p>
         </w:tc>
         <w:tc>
           <w:tcPr>
-            <w:tcW w:type="dxa" w:w="1728"/>
+            <w:tcW w:type="dxa" w:w="2376"/>
             <w:vAlign w:val="center"/>
             <w:tcMar>
               <w:top w:w="65" w:type="dxa"/>
@@ -1599,13 +2182,13 @@
                 <w:color w:val="000000"/>
                 <w:sz w:val="16"/>
               </w:rPr>
-              <w:t>3.161</w:t>
+              <w:t>3.824</w:t>
             </w:r>
           </w:p>
         </w:tc>
         <w:tc>
           <w:tcPr>
-            <w:tcW w:type="dxa" w:w="1872"/>
+            <w:tcW w:type="dxa" w:w="2376"/>
             <w:vAlign w:val="center"/>
             <w:tcMar>
               <w:top w:w="65" w:type="dxa"/>
@@ -1633,869 +2216,7 @@
                 <w:color w:val="000000"/>
                 <w:sz w:val="16"/>
               </w:rPr>
-              <w:t>4.135</w:t>
-            </w:r>
-          </w:p>
-        </w:tc>
-        <w:tc>
-          <w:tcPr>
-            <w:tcW w:type="dxa" w:w="1800"/>
-            <w:vAlign w:val="center"/>
-            <w:tcMar>
-              <w:top w:w="65" w:type="dxa"/>
-              <w:left w:w="85" w:type="dxa"/>
-              <w:bottom w:w="65" w:type="dxa"/>
-              <w:right w:w="85" w:type="dxa"/>
-            </w:tcMar>
-            <w:shd w:fill="FFFFFF"/>
-            <w:tcBorders>
-              <w:top w:val="single" w:sz="4" w:color="D9D9D9"/>
-              <w:left w:val="single" w:sz="4" w:color="D9D9D9"/>
-              <w:bottom w:val="single" w:sz="4" w:color="D9D9D9"/>
-              <w:right w:val="single" w:sz="4" w:color="D9D9D9"/>
-            </w:tcBorders>
-          </w:tcPr>
-          <w:p>
-            <w:pPr>
-              <w:spacing w:after="0" w:line="240" w:lineRule="auto"/>
-              <w:jc w:val="center"/>
-            </w:pPr>
-            <w:r>
-              <w:rPr>
-                <w:rFonts w:ascii="Arial" w:hAnsi="Arial"/>
-                <w:b w:val="0"/>
-                <w:color w:val="000000"/>
-                <w:sz w:val="16"/>
-              </w:rPr>
-              <w:t>-0.009</w:t>
-            </w:r>
-          </w:p>
-        </w:tc>
-      </w:tr>
-      <w:tr>
-        <w:trPr>
-          <w:cantSplit/>
-        </w:trPr>
-        <w:tc>
-          <w:tcPr>
-            <w:tcW w:type="dxa" w:w="2520"/>
-            <w:vAlign w:val="center"/>
-            <w:tcMar>
-              <w:top w:w="65" w:type="dxa"/>
-              <w:left w:w="85" w:type="dxa"/>
-              <w:bottom w:w="65" w:type="dxa"/>
-              <w:right w:w="85" w:type="dxa"/>
-            </w:tcMar>
-            <w:shd w:fill="F5F5F5"/>
-            <w:tcBorders>
-              <w:top w:val="single" w:sz="4" w:color="D9D9D9"/>
-              <w:left w:val="single" w:sz="4" w:color="D9D9D9"/>
-              <w:bottom w:val="single" w:sz="4" w:color="D9D9D9"/>
-              <w:right w:val="single" w:sz="4" w:color="D9D9D9"/>
-            </w:tcBorders>
-          </w:tcPr>
-          <w:p>
-            <w:pPr>
-              <w:spacing w:after="0" w:line="240" w:lineRule="auto"/>
-            </w:pPr>
-            <w:r>
-              <w:rPr>
-                <w:rFonts w:ascii="Arial" w:hAnsi="Arial"/>
-                <w:b w:val="0"/>
-                <w:color w:val="000000"/>
-                <w:sz w:val="16"/>
-              </w:rPr>
-              <w:t>SPY-adjusted / 2023-24</w:t>
-            </w:r>
-          </w:p>
-        </w:tc>
-        <w:tc>
-          <w:tcPr>
-            <w:tcW w:type="dxa" w:w="1872"/>
-            <w:vAlign w:val="center"/>
-            <w:tcMar>
-              <w:top w:w="65" w:type="dxa"/>
-              <w:left w:w="85" w:type="dxa"/>
-              <w:bottom w:w="65" w:type="dxa"/>
-              <w:right w:w="85" w:type="dxa"/>
-            </w:tcMar>
-            <w:shd w:fill="F5F5F5"/>
-            <w:tcBorders>
-              <w:top w:val="single" w:sz="4" w:color="D9D9D9"/>
-              <w:left w:val="single" w:sz="4" w:color="D9D9D9"/>
-              <w:bottom w:val="single" w:sz="4" w:color="D9D9D9"/>
-              <w:right w:val="single" w:sz="4" w:color="D9D9D9"/>
-            </w:tcBorders>
-          </w:tcPr>
-          <w:p>
-            <w:pPr>
-              <w:spacing w:after="0" w:line="240" w:lineRule="auto"/>
-            </w:pPr>
-            <w:r>
-              <w:rPr>
-                <w:rFonts w:ascii="Arial" w:hAnsi="Arial"/>
-                <w:b w:val="0"/>
-                <w:color w:val="000000"/>
-                <w:sz w:val="16"/>
-              </w:rPr>
-              <w:t>OLS</w:t>
-            </w:r>
-          </w:p>
-        </w:tc>
-        <w:tc>
-          <w:tcPr>
-            <w:tcW w:type="dxa" w:w="576"/>
-            <w:vAlign w:val="center"/>
-            <w:tcMar>
-              <w:top w:w="65" w:type="dxa"/>
-              <w:left w:w="85" w:type="dxa"/>
-              <w:bottom w:w="65" w:type="dxa"/>
-              <w:right w:w="85" w:type="dxa"/>
-            </w:tcMar>
-            <w:shd w:fill="F5F5F5"/>
-            <w:tcBorders>
-              <w:top w:val="single" w:sz="4" w:color="D9D9D9"/>
-              <w:left w:val="single" w:sz="4" w:color="D9D9D9"/>
-              <w:bottom w:val="single" w:sz="4" w:color="D9D9D9"/>
-              <w:right w:val="single" w:sz="4" w:color="D9D9D9"/>
-            </w:tcBorders>
-          </w:tcPr>
-          <w:p>
-            <w:pPr>
-              <w:spacing w:after="0" w:line="240" w:lineRule="auto"/>
-              <w:jc w:val="center"/>
-            </w:pPr>
-            <w:r>
-              <w:rPr>
-                <w:rFonts w:ascii="Arial" w:hAnsi="Arial"/>
-                <w:b w:val="0"/>
-                <w:color w:val="000000"/>
-                <w:sz w:val="16"/>
-              </w:rPr>
-              <w:t>80</w:t>
-            </w:r>
-          </w:p>
-        </w:tc>
-        <w:tc>
-          <w:tcPr>
-            <w:tcW w:type="dxa" w:w="1728"/>
-            <w:vAlign w:val="center"/>
-            <w:tcMar>
-              <w:top w:w="65" w:type="dxa"/>
-              <w:left w:w="85" w:type="dxa"/>
-              <w:bottom w:w="65" w:type="dxa"/>
-              <w:right w:w="85" w:type="dxa"/>
-            </w:tcMar>
-            <w:shd w:fill="F5F5F5"/>
-            <w:tcBorders>
-              <w:top w:val="single" w:sz="4" w:color="D9D9D9"/>
-              <w:left w:val="single" w:sz="4" w:color="D9D9D9"/>
-              <w:bottom w:val="single" w:sz="4" w:color="D9D9D9"/>
-              <w:right w:val="single" w:sz="4" w:color="D9D9D9"/>
-            </w:tcBorders>
-          </w:tcPr>
-          <w:p>
-            <w:pPr>
-              <w:spacing w:after="0" w:line="240" w:lineRule="auto"/>
-              <w:jc w:val="center"/>
-            </w:pPr>
-            <w:r>
-              <w:rPr>
-                <w:rFonts w:ascii="Arial" w:hAnsi="Arial"/>
-                <w:b w:val="0"/>
-                <w:color w:val="000000"/>
-                <w:sz w:val="16"/>
-              </w:rPr>
-              <w:t>2.381</w:t>
-            </w:r>
-          </w:p>
-        </w:tc>
-        <w:tc>
-          <w:tcPr>
-            <w:tcW w:type="dxa" w:w="1872"/>
-            <w:vAlign w:val="center"/>
-            <w:tcMar>
-              <w:top w:w="65" w:type="dxa"/>
-              <w:left w:w="85" w:type="dxa"/>
-              <w:bottom w:w="65" w:type="dxa"/>
-              <w:right w:w="85" w:type="dxa"/>
-            </w:tcMar>
-            <w:shd w:fill="F5F5F5"/>
-            <w:tcBorders>
-              <w:top w:val="single" w:sz="4" w:color="D9D9D9"/>
-              <w:left w:val="single" w:sz="4" w:color="D9D9D9"/>
-              <w:bottom w:val="single" w:sz="4" w:color="D9D9D9"/>
-              <w:right w:val="single" w:sz="4" w:color="D9D9D9"/>
-            </w:tcBorders>
-          </w:tcPr>
-          <w:p>
-            <w:pPr>
-              <w:spacing w:after="0" w:line="240" w:lineRule="auto"/>
-              <w:jc w:val="center"/>
-            </w:pPr>
-            <w:r>
-              <w:rPr>
-                <w:rFonts w:ascii="Arial" w:hAnsi="Arial"/>
-                <w:b w:val="0"/>
-                <w:color w:val="000000"/>
-                <w:sz w:val="16"/>
-              </w:rPr>
-              <w:t>3.085</w:t>
-            </w:r>
-          </w:p>
-        </w:tc>
-        <w:tc>
-          <w:tcPr>
-            <w:tcW w:type="dxa" w:w="1800"/>
-            <w:vAlign w:val="center"/>
-            <w:tcMar>
-              <w:top w:w="65" w:type="dxa"/>
-              <w:left w:w="85" w:type="dxa"/>
-              <w:bottom w:w="65" w:type="dxa"/>
-              <w:right w:w="85" w:type="dxa"/>
-            </w:tcMar>
-            <w:shd w:fill="F5F5F5"/>
-            <w:tcBorders>
-              <w:top w:val="single" w:sz="4" w:color="D9D9D9"/>
-              <w:left w:val="single" w:sz="4" w:color="D9D9D9"/>
-              <w:bottom w:val="single" w:sz="4" w:color="D9D9D9"/>
-              <w:right w:val="single" w:sz="4" w:color="D9D9D9"/>
-            </w:tcBorders>
-          </w:tcPr>
-          <w:p>
-            <w:pPr>
-              <w:spacing w:after="0" w:line="240" w:lineRule="auto"/>
-              <w:jc w:val="center"/>
-            </w:pPr>
-            <w:r>
-              <w:rPr>
-                <w:rFonts w:ascii="Arial" w:hAnsi="Arial"/>
-                <w:b w:val="0"/>
-                <w:color w:val="000000"/>
-                <w:sz w:val="16"/>
-              </w:rPr>
-              <w:t>-0.199</w:t>
-            </w:r>
-          </w:p>
-        </w:tc>
-      </w:tr>
-      <w:tr>
-        <w:trPr>
-          <w:cantSplit/>
-        </w:trPr>
-        <w:tc>
-          <w:tcPr>
-            <w:tcW w:type="dxa" w:w="2520"/>
-            <w:vAlign w:val="center"/>
-            <w:tcMar>
-              <w:top w:w="65" w:type="dxa"/>
-              <w:left w:w="85" w:type="dxa"/>
-              <w:bottom w:w="65" w:type="dxa"/>
-              <w:right w:w="85" w:type="dxa"/>
-            </w:tcMar>
-            <w:shd w:fill="FFFFFF"/>
-            <w:tcBorders>
-              <w:top w:val="single" w:sz="4" w:color="D9D9D9"/>
-              <w:left w:val="single" w:sz="4" w:color="D9D9D9"/>
-              <w:bottom w:val="single" w:sz="4" w:color="D9D9D9"/>
-              <w:right w:val="single" w:sz="4" w:color="D9D9D9"/>
-            </w:tcBorders>
-          </w:tcPr>
-          <w:p>
-            <w:pPr>
-              <w:spacing w:after="0" w:line="240" w:lineRule="auto"/>
-            </w:pPr>
-            <w:r>
-              <w:rPr>
-                <w:rFonts w:ascii="Arial" w:hAnsi="Arial"/>
-                <w:b w:val="0"/>
-                <w:color w:val="000000"/>
-                <w:sz w:val="16"/>
-              </w:rPr>
-              <w:t>SPY-adjusted / 2023-24</w:t>
-            </w:r>
-          </w:p>
-        </w:tc>
-        <w:tc>
-          <w:tcPr>
-            <w:tcW w:type="dxa" w:w="1872"/>
-            <w:vAlign w:val="center"/>
-            <w:tcMar>
-              <w:top w:w="65" w:type="dxa"/>
-              <w:left w:w="85" w:type="dxa"/>
-              <w:bottom w:w="65" w:type="dxa"/>
-              <w:right w:w="85" w:type="dxa"/>
-            </w:tcMar>
-            <w:shd w:fill="FFFFFF"/>
-            <w:tcBorders>
-              <w:top w:val="single" w:sz="4" w:color="D9D9D9"/>
-              <w:left w:val="single" w:sz="4" w:color="D9D9D9"/>
-              <w:bottom w:val="single" w:sz="4" w:color="D9D9D9"/>
-              <w:right w:val="single" w:sz="4" w:color="D9D9D9"/>
-            </w:tcBorders>
-          </w:tcPr>
-          <w:p>
-            <w:pPr>
-              <w:spacing w:after="0" w:line="240" w:lineRule="auto"/>
-            </w:pPr>
-            <w:r>
-              <w:rPr>
-                <w:rFonts w:ascii="Arial" w:hAnsi="Arial"/>
-                <w:b w:val="0"/>
-                <w:color w:val="000000"/>
-                <w:sz w:val="16"/>
-              </w:rPr>
-              <w:t>Training mean</w:t>
-            </w:r>
-          </w:p>
-        </w:tc>
-        <w:tc>
-          <w:tcPr>
-            <w:tcW w:type="dxa" w:w="576"/>
-            <w:vAlign w:val="center"/>
-            <w:tcMar>
-              <w:top w:w="65" w:type="dxa"/>
-              <w:left w:w="85" w:type="dxa"/>
-              <w:bottom w:w="65" w:type="dxa"/>
-              <w:right w:w="85" w:type="dxa"/>
-            </w:tcMar>
-            <w:shd w:fill="FFFFFF"/>
-            <w:tcBorders>
-              <w:top w:val="single" w:sz="4" w:color="D9D9D9"/>
-              <w:left w:val="single" w:sz="4" w:color="D9D9D9"/>
-              <w:bottom w:val="single" w:sz="4" w:color="D9D9D9"/>
-              <w:right w:val="single" w:sz="4" w:color="D9D9D9"/>
-            </w:tcBorders>
-          </w:tcPr>
-          <w:p>
-            <w:pPr>
-              <w:spacing w:after="0" w:line="240" w:lineRule="auto"/>
-              <w:jc w:val="center"/>
-            </w:pPr>
-            <w:r>
-              <w:rPr>
-                <w:rFonts w:ascii="Arial" w:hAnsi="Arial"/>
-                <w:b w:val="0"/>
-                <w:color w:val="000000"/>
-                <w:sz w:val="16"/>
-              </w:rPr>
-              <w:t>80</w:t>
-            </w:r>
-          </w:p>
-        </w:tc>
-        <w:tc>
-          <w:tcPr>
-            <w:tcW w:type="dxa" w:w="1728"/>
-            <w:vAlign w:val="center"/>
-            <w:tcMar>
-              <w:top w:w="65" w:type="dxa"/>
-              <w:left w:w="85" w:type="dxa"/>
-              <w:bottom w:w="65" w:type="dxa"/>
-              <w:right w:w="85" w:type="dxa"/>
-            </w:tcMar>
-            <w:shd w:fill="FFFFFF"/>
-            <w:tcBorders>
-              <w:top w:val="single" w:sz="4" w:color="D9D9D9"/>
-              <w:left w:val="single" w:sz="4" w:color="D9D9D9"/>
-              <w:bottom w:val="single" w:sz="4" w:color="D9D9D9"/>
-              <w:right w:val="single" w:sz="4" w:color="D9D9D9"/>
-            </w:tcBorders>
-          </w:tcPr>
-          <w:p>
-            <w:pPr>
-              <w:spacing w:after="0" w:line="240" w:lineRule="auto"/>
-              <w:jc w:val="center"/>
-            </w:pPr>
-            <w:r>
-              <w:rPr>
-                <w:rFonts w:ascii="Arial" w:hAnsi="Arial"/>
-                <w:b w:val="0"/>
-                <w:color w:val="000000"/>
-                <w:sz w:val="16"/>
-              </w:rPr>
-              <w:t>2.099</w:t>
-            </w:r>
-          </w:p>
-        </w:tc>
-        <w:tc>
-          <w:tcPr>
-            <w:tcW w:type="dxa" w:w="1872"/>
-            <w:vAlign w:val="center"/>
-            <w:tcMar>
-              <w:top w:w="65" w:type="dxa"/>
-              <w:left w:w="85" w:type="dxa"/>
-              <w:bottom w:w="65" w:type="dxa"/>
-              <w:right w:w="85" w:type="dxa"/>
-            </w:tcMar>
-            <w:shd w:fill="FFFFFF"/>
-            <w:tcBorders>
-              <w:top w:val="single" w:sz="4" w:color="D9D9D9"/>
-              <w:left w:val="single" w:sz="4" w:color="D9D9D9"/>
-              <w:bottom w:val="single" w:sz="4" w:color="D9D9D9"/>
-              <w:right w:val="single" w:sz="4" w:color="D9D9D9"/>
-            </w:tcBorders>
-          </w:tcPr>
-          <w:p>
-            <w:pPr>
-              <w:spacing w:after="0" w:line="240" w:lineRule="auto"/>
-              <w:jc w:val="center"/>
-            </w:pPr>
-            <w:r>
-              <w:rPr>
-                <w:rFonts w:ascii="Arial" w:hAnsi="Arial"/>
-                <w:b w:val="0"/>
-                <w:color w:val="000000"/>
-                <w:sz w:val="16"/>
-              </w:rPr>
-              <w:t>2.818</w:t>
-            </w:r>
-          </w:p>
-        </w:tc>
-        <w:tc>
-          <w:tcPr>
-            <w:tcW w:type="dxa" w:w="1800"/>
-            <w:vAlign w:val="center"/>
-            <w:tcMar>
-              <w:top w:w="65" w:type="dxa"/>
-              <w:left w:w="85" w:type="dxa"/>
-              <w:bottom w:w="65" w:type="dxa"/>
-              <w:right w:w="85" w:type="dxa"/>
-            </w:tcMar>
-            <w:shd w:fill="FFFFFF"/>
-            <w:tcBorders>
-              <w:top w:val="single" w:sz="4" w:color="D9D9D9"/>
-              <w:left w:val="single" w:sz="4" w:color="D9D9D9"/>
-              <w:bottom w:val="single" w:sz="4" w:color="D9D9D9"/>
-              <w:right w:val="single" w:sz="4" w:color="D9D9D9"/>
-            </w:tcBorders>
-          </w:tcPr>
-          <w:p>
-            <w:pPr>
-              <w:spacing w:after="0" w:line="240" w:lineRule="auto"/>
-              <w:jc w:val="center"/>
-            </w:pPr>
-            <w:r>
-              <w:rPr>
-                <w:rFonts w:ascii="Arial" w:hAnsi="Arial"/>
-                <w:b w:val="0"/>
-                <w:color w:val="000000"/>
-                <w:sz w:val="16"/>
-              </w:rPr>
-              <w:t>-0.001</w:t>
-            </w:r>
-          </w:p>
-        </w:tc>
-      </w:tr>
-      <w:tr>
-        <w:trPr>
-          <w:cantSplit/>
-        </w:trPr>
-        <w:tc>
-          <w:tcPr>
-            <w:tcW w:type="dxa" w:w="2520"/>
-            <w:vAlign w:val="center"/>
-            <w:tcMar>
-              <w:top w:w="65" w:type="dxa"/>
-              <w:left w:w="85" w:type="dxa"/>
-              <w:bottom w:w="65" w:type="dxa"/>
-              <w:right w:w="85" w:type="dxa"/>
-            </w:tcMar>
-            <w:shd w:fill="F5F5F5"/>
-            <w:tcBorders>
-              <w:top w:val="single" w:sz="4" w:color="D9D9D9"/>
-              <w:left w:val="single" w:sz="4" w:color="D9D9D9"/>
-              <w:bottom w:val="single" w:sz="4" w:color="D9D9D9"/>
-              <w:right w:val="single" w:sz="4" w:color="D9D9D9"/>
-            </w:tcBorders>
-          </w:tcPr>
-          <w:p>
-            <w:pPr>
-              <w:spacing w:after="0" w:line="240" w:lineRule="auto"/>
-            </w:pPr>
-            <w:r>
-              <w:rPr>
-                <w:rFonts w:ascii="Arial" w:hAnsi="Arial"/>
-                <w:b w:val="0"/>
-                <w:color w:val="000000"/>
-                <w:sz w:val="16"/>
-              </w:rPr>
-              <w:t>SPY-adjusted / 2025</w:t>
-            </w:r>
-          </w:p>
-        </w:tc>
-        <w:tc>
-          <w:tcPr>
-            <w:tcW w:type="dxa" w:w="1872"/>
-            <w:vAlign w:val="center"/>
-            <w:tcMar>
-              <w:top w:w="65" w:type="dxa"/>
-              <w:left w:w="85" w:type="dxa"/>
-              <w:bottom w:w="65" w:type="dxa"/>
-              <w:right w:w="85" w:type="dxa"/>
-            </w:tcMar>
-            <w:shd w:fill="F5F5F5"/>
-            <w:tcBorders>
-              <w:top w:val="single" w:sz="4" w:color="D9D9D9"/>
-              <w:left w:val="single" w:sz="4" w:color="D9D9D9"/>
-              <w:bottom w:val="single" w:sz="4" w:color="D9D9D9"/>
-              <w:right w:val="single" w:sz="4" w:color="D9D9D9"/>
-            </w:tcBorders>
-          </w:tcPr>
-          <w:p>
-            <w:pPr>
-              <w:spacing w:after="0" w:line="240" w:lineRule="auto"/>
-            </w:pPr>
-            <w:r>
-              <w:rPr>
-                <w:rFonts w:ascii="Arial" w:hAnsi="Arial"/>
-                <w:b w:val="0"/>
-                <w:color w:val="000000"/>
-                <w:sz w:val="16"/>
-              </w:rPr>
-              <w:t>OLS</w:t>
-            </w:r>
-          </w:p>
-        </w:tc>
-        <w:tc>
-          <w:tcPr>
-            <w:tcW w:type="dxa" w:w="576"/>
-            <w:vAlign w:val="center"/>
-            <w:tcMar>
-              <w:top w:w="65" w:type="dxa"/>
-              <w:left w:w="85" w:type="dxa"/>
-              <w:bottom w:w="65" w:type="dxa"/>
-              <w:right w:w="85" w:type="dxa"/>
-            </w:tcMar>
-            <w:shd w:fill="F5F5F5"/>
-            <w:tcBorders>
-              <w:top w:val="single" w:sz="4" w:color="D9D9D9"/>
-              <w:left w:val="single" w:sz="4" w:color="D9D9D9"/>
-              <w:bottom w:val="single" w:sz="4" w:color="D9D9D9"/>
-              <w:right w:val="single" w:sz="4" w:color="D9D9D9"/>
-            </w:tcBorders>
-          </w:tcPr>
-          <w:p>
-            <w:pPr>
-              <w:spacing w:after="0" w:line="240" w:lineRule="auto"/>
-              <w:jc w:val="center"/>
-            </w:pPr>
-            <w:r>
-              <w:rPr>
-                <w:rFonts w:ascii="Arial" w:hAnsi="Arial"/>
-                <w:b w:val="0"/>
-                <w:color w:val="000000"/>
-                <w:sz w:val="16"/>
-              </w:rPr>
-              <w:t>40</w:t>
-            </w:r>
-          </w:p>
-        </w:tc>
-        <w:tc>
-          <w:tcPr>
-            <w:tcW w:type="dxa" w:w="1728"/>
-            <w:vAlign w:val="center"/>
-            <w:tcMar>
-              <w:top w:w="65" w:type="dxa"/>
-              <w:left w:w="85" w:type="dxa"/>
-              <w:bottom w:w="65" w:type="dxa"/>
-              <w:right w:w="85" w:type="dxa"/>
-            </w:tcMar>
-            <w:shd w:fill="F5F5F5"/>
-            <w:tcBorders>
-              <w:top w:val="single" w:sz="4" w:color="D9D9D9"/>
-              <w:left w:val="single" w:sz="4" w:color="D9D9D9"/>
-              <w:bottom w:val="single" w:sz="4" w:color="D9D9D9"/>
-              <w:right w:val="single" w:sz="4" w:color="D9D9D9"/>
-            </w:tcBorders>
-          </w:tcPr>
-          <w:p>
-            <w:pPr>
-              <w:spacing w:after="0" w:line="240" w:lineRule="auto"/>
-              <w:jc w:val="center"/>
-            </w:pPr>
-            <w:r>
-              <w:rPr>
-                <w:rFonts w:ascii="Arial" w:hAnsi="Arial"/>
-                <w:b w:val="0"/>
-                <w:color w:val="000000"/>
-                <w:sz w:val="16"/>
-              </w:rPr>
-              <w:t>2.876</w:t>
-            </w:r>
-          </w:p>
-        </w:tc>
-        <w:tc>
-          <w:tcPr>
-            <w:tcW w:type="dxa" w:w="1872"/>
-            <w:vAlign w:val="center"/>
-            <w:tcMar>
-              <w:top w:w="65" w:type="dxa"/>
-              <w:left w:w="85" w:type="dxa"/>
-              <w:bottom w:w="65" w:type="dxa"/>
-              <w:right w:w="85" w:type="dxa"/>
-            </w:tcMar>
-            <w:shd w:fill="F5F5F5"/>
-            <w:tcBorders>
-              <w:top w:val="single" w:sz="4" w:color="D9D9D9"/>
-              <w:left w:val="single" w:sz="4" w:color="D9D9D9"/>
-              <w:bottom w:val="single" w:sz="4" w:color="D9D9D9"/>
-              <w:right w:val="single" w:sz="4" w:color="D9D9D9"/>
-            </w:tcBorders>
-          </w:tcPr>
-          <w:p>
-            <w:pPr>
-              <w:spacing w:after="0" w:line="240" w:lineRule="auto"/>
-              <w:jc w:val="center"/>
-            </w:pPr>
-            <w:r>
-              <w:rPr>
-                <w:rFonts w:ascii="Arial" w:hAnsi="Arial"/>
-                <w:b w:val="0"/>
-                <w:color w:val="000000"/>
-                <w:sz w:val="16"/>
-              </w:rPr>
-              <w:t>3.606</w:t>
-            </w:r>
-          </w:p>
-        </w:tc>
-        <w:tc>
-          <w:tcPr>
-            <w:tcW w:type="dxa" w:w="1800"/>
-            <w:vAlign w:val="center"/>
-            <w:tcMar>
-              <w:top w:w="65" w:type="dxa"/>
-              <w:left w:w="85" w:type="dxa"/>
-              <w:bottom w:w="65" w:type="dxa"/>
-              <w:right w:w="85" w:type="dxa"/>
-            </w:tcMar>
-            <w:shd w:fill="F5F5F5"/>
-            <w:tcBorders>
-              <w:top w:val="single" w:sz="4" w:color="D9D9D9"/>
-              <w:left w:val="single" w:sz="4" w:color="D9D9D9"/>
-              <w:bottom w:val="single" w:sz="4" w:color="D9D9D9"/>
-              <w:right w:val="single" w:sz="4" w:color="D9D9D9"/>
-            </w:tcBorders>
-          </w:tcPr>
-          <w:p>
-            <w:pPr>
-              <w:spacing w:after="0" w:line="240" w:lineRule="auto"/>
-              <w:jc w:val="center"/>
-            </w:pPr>
-            <w:r>
-              <w:rPr>
-                <w:rFonts w:ascii="Arial" w:hAnsi="Arial"/>
-                <w:b w:val="0"/>
-                <w:color w:val="000000"/>
-                <w:sz w:val="16"/>
-              </w:rPr>
-              <w:t>0.018</w:t>
-            </w:r>
-          </w:p>
-        </w:tc>
-      </w:tr>
-      <w:tr>
-        <w:trPr>
-          <w:cantSplit/>
-        </w:trPr>
-        <w:tc>
-          <w:tcPr>
-            <w:tcW w:type="dxa" w:w="2520"/>
-            <w:vAlign w:val="center"/>
-            <w:tcMar>
-              <w:top w:w="65" w:type="dxa"/>
-              <w:left w:w="85" w:type="dxa"/>
-              <w:bottom w:w="65" w:type="dxa"/>
-              <w:right w:w="85" w:type="dxa"/>
-            </w:tcMar>
-            <w:shd w:fill="FFFFFF"/>
-            <w:tcBorders>
-              <w:top w:val="single" w:sz="4" w:color="D9D9D9"/>
-              <w:left w:val="single" w:sz="4" w:color="D9D9D9"/>
-              <w:bottom w:val="single" w:sz="4" w:color="D9D9D9"/>
-              <w:right w:val="single" w:sz="4" w:color="D9D9D9"/>
-            </w:tcBorders>
-          </w:tcPr>
-          <w:p>
-            <w:pPr>
-              <w:spacing w:after="0" w:line="240" w:lineRule="auto"/>
-            </w:pPr>
-            <w:r>
-              <w:rPr>
-                <w:rFonts w:ascii="Arial" w:hAnsi="Arial"/>
-                <w:b w:val="0"/>
-                <w:color w:val="000000"/>
-                <w:sz w:val="16"/>
-              </w:rPr>
-              <w:t>SPY-adjusted / 2025</w:t>
-            </w:r>
-          </w:p>
-        </w:tc>
-        <w:tc>
-          <w:tcPr>
-            <w:tcW w:type="dxa" w:w="1872"/>
-            <w:vAlign w:val="center"/>
-            <w:tcMar>
-              <w:top w:w="65" w:type="dxa"/>
-              <w:left w:w="85" w:type="dxa"/>
-              <w:bottom w:w="65" w:type="dxa"/>
-              <w:right w:w="85" w:type="dxa"/>
-            </w:tcMar>
-            <w:shd w:fill="FFFFFF"/>
-            <w:tcBorders>
-              <w:top w:val="single" w:sz="4" w:color="D9D9D9"/>
-              <w:left w:val="single" w:sz="4" w:color="D9D9D9"/>
-              <w:bottom w:val="single" w:sz="4" w:color="D9D9D9"/>
-              <w:right w:val="single" w:sz="4" w:color="D9D9D9"/>
-            </w:tcBorders>
-          </w:tcPr>
-          <w:p>
-            <w:pPr>
-              <w:spacing w:after="0" w:line="240" w:lineRule="auto"/>
-            </w:pPr>
-            <w:r>
-              <w:rPr>
-                <w:rFonts w:ascii="Arial" w:hAnsi="Arial"/>
-                <w:b w:val="0"/>
-                <w:color w:val="000000"/>
-                <w:sz w:val="16"/>
-              </w:rPr>
-              <w:t>Training mean</w:t>
-            </w:r>
-          </w:p>
-        </w:tc>
-        <w:tc>
-          <w:tcPr>
-            <w:tcW w:type="dxa" w:w="576"/>
-            <w:vAlign w:val="center"/>
-            <w:tcMar>
-              <w:top w:w="65" w:type="dxa"/>
-              <w:left w:w="85" w:type="dxa"/>
-              <w:bottom w:w="65" w:type="dxa"/>
-              <w:right w:w="85" w:type="dxa"/>
-            </w:tcMar>
-            <w:shd w:fill="FFFFFF"/>
-            <w:tcBorders>
-              <w:top w:val="single" w:sz="4" w:color="D9D9D9"/>
-              <w:left w:val="single" w:sz="4" w:color="D9D9D9"/>
-              <w:bottom w:val="single" w:sz="4" w:color="D9D9D9"/>
-              <w:right w:val="single" w:sz="4" w:color="D9D9D9"/>
-            </w:tcBorders>
-          </w:tcPr>
-          <w:p>
-            <w:pPr>
-              <w:spacing w:after="0" w:line="240" w:lineRule="auto"/>
-              <w:jc w:val="center"/>
-            </w:pPr>
-            <w:r>
-              <w:rPr>
-                <w:rFonts w:ascii="Arial" w:hAnsi="Arial"/>
-                <w:b w:val="0"/>
-                <w:color w:val="000000"/>
-                <w:sz w:val="16"/>
-              </w:rPr>
-              <w:t>40</w:t>
-            </w:r>
-          </w:p>
-        </w:tc>
-        <w:tc>
-          <w:tcPr>
-            <w:tcW w:type="dxa" w:w="1728"/>
-            <w:vAlign w:val="center"/>
-            <w:tcMar>
-              <w:top w:w="65" w:type="dxa"/>
-              <w:left w:w="85" w:type="dxa"/>
-              <w:bottom w:w="65" w:type="dxa"/>
-              <w:right w:w="85" w:type="dxa"/>
-            </w:tcMar>
-            <w:shd w:fill="FFFFFF"/>
-            <w:tcBorders>
-              <w:top w:val="single" w:sz="4" w:color="D9D9D9"/>
-              <w:left w:val="single" w:sz="4" w:color="D9D9D9"/>
-              <w:bottom w:val="single" w:sz="4" w:color="D9D9D9"/>
-              <w:right w:val="single" w:sz="4" w:color="D9D9D9"/>
-            </w:tcBorders>
-          </w:tcPr>
-          <w:p>
-            <w:pPr>
-              <w:spacing w:after="0" w:line="240" w:lineRule="auto"/>
-              <w:jc w:val="center"/>
-            </w:pPr>
-            <w:r>
-              <w:rPr>
-                <w:rFonts w:ascii="Arial" w:hAnsi="Arial"/>
-                <w:b w:val="0"/>
-                <w:color w:val="000000"/>
-                <w:sz w:val="16"/>
-              </w:rPr>
-              <w:t>2.974</w:t>
-            </w:r>
-          </w:p>
-        </w:tc>
-        <w:tc>
-          <w:tcPr>
-            <w:tcW w:type="dxa" w:w="1872"/>
-            <w:vAlign w:val="center"/>
-            <w:tcMar>
-              <w:top w:w="65" w:type="dxa"/>
-              <w:left w:w="85" w:type="dxa"/>
-              <w:bottom w:w="65" w:type="dxa"/>
-              <w:right w:w="85" w:type="dxa"/>
-            </w:tcMar>
-            <w:shd w:fill="FFFFFF"/>
-            <w:tcBorders>
-              <w:top w:val="single" w:sz="4" w:color="D9D9D9"/>
-              <w:left w:val="single" w:sz="4" w:color="D9D9D9"/>
-              <w:bottom w:val="single" w:sz="4" w:color="D9D9D9"/>
-              <w:right w:val="single" w:sz="4" w:color="D9D9D9"/>
-            </w:tcBorders>
-          </w:tcPr>
-          <w:p>
-            <w:pPr>
-              <w:spacing w:after="0" w:line="240" w:lineRule="auto"/>
-              <w:jc w:val="center"/>
-            </w:pPr>
-            <w:r>
-              <w:rPr>
-                <w:rFonts w:ascii="Arial" w:hAnsi="Arial"/>
-                <w:b w:val="0"/>
-                <w:color w:val="000000"/>
-                <w:sz w:val="16"/>
-              </w:rPr>
-              <w:t>3.651</w:t>
-            </w:r>
-          </w:p>
-        </w:tc>
-        <w:tc>
-          <w:tcPr>
-            <w:tcW w:type="dxa" w:w="1800"/>
-            <w:vAlign w:val="center"/>
-            <w:tcMar>
-              <w:top w:w="65" w:type="dxa"/>
-              <w:left w:w="85" w:type="dxa"/>
-              <w:bottom w:w="65" w:type="dxa"/>
-              <w:right w:w="85" w:type="dxa"/>
-            </w:tcMar>
-            <w:shd w:fill="FFFFFF"/>
-            <w:tcBorders>
-              <w:top w:val="single" w:sz="4" w:color="D9D9D9"/>
-              <w:left w:val="single" w:sz="4" w:color="D9D9D9"/>
-              <w:bottom w:val="single" w:sz="4" w:color="D9D9D9"/>
-              <w:right w:val="single" w:sz="4" w:color="D9D9D9"/>
-            </w:tcBorders>
-          </w:tcPr>
-          <w:p>
-            <w:pPr>
-              <w:spacing w:after="0" w:line="240" w:lineRule="auto"/>
-              <w:jc w:val="center"/>
-            </w:pPr>
-            <w:r>
-              <w:rPr>
-                <w:rFonts w:ascii="Arial" w:hAnsi="Arial"/>
-                <w:b w:val="0"/>
-                <w:color w:val="000000"/>
-                <w:sz w:val="16"/>
-              </w:rPr>
-              <w:t>-0.007</w:t>
+              <w:t>4.264</w:t>
             </w:r>
           </w:p>
         </w:tc>
@@ -2516,12 +2237,7 @@
         <w:pStyle w:val="Caption"/>
       </w:pPr>
       <w:r>
-        <w:t>Table 1. Errors are percentage points of five-session return; lower is better. MAE averages absolute errors, RMSE emphasizes large errors, and negative R-squared indicates worse squared error than the evaluation-period mean. The actionable reference is estimated from training only.</w:t>
-      </w:r>
-    </w:p>
-    <w:p>
-      <w:r>
-        <w:t>Raw-return OLS raises RMSE by 7.43% in validation and 2.87% in 2025 relative to the training mean. Direction accuracy is 57.5% and 55.0%, versus 57.5% and 60.0% for always predicting a positive return. SPY-adjusted OLS raises validation RMSE by 9.47% and lowers 2025 RMSE by only 1.24%; this isolated improvement is not reliable evidence of skill. Zero forecasts give raw-return RMSE of 3.586/4.152 pp and SPY-adjusted RMSE of 2.832/3.639 pp, also showing the need for a naive comparison.</w:t>
+        <w:t>Table 2. All 80 validation and 40 test events are retained in every treatment. Surprise exclusion removes training rows with absolute current surprise above 100%. Influence exclusion uses original training Cook's distance above 4/n. Clipping uses training 1st/99th percentiles of current and prior surprise; it never clips outcomes. Each variant refits scaling and OLS using its training data only.</w:t>
       </w:r>
     </w:p>
     <w:p>
@@ -2533,8 +2249,8 @@
       <w:r>
         <w:drawing>
           <wp:inline xmlns:a="http://schemas.openxmlformats.org/drawingml/2006/main" xmlns:pic="http://schemas.openxmlformats.org/drawingml/2006/picture">
-            <wp:extent cx="6080760" cy="2210330"/>
-            <wp:docPr id="3" name="Picture 3" descr="Figure 3. Held-out raw-return residuals versus prediction and time. Large errors remain; independence and constant variance are not established."/>
+            <wp:extent cx="6080760" cy="2564790"/>
+            <wp:docPr id="3" name="Picture 3" descr="Figure 3. Outlier sensitivity on unchanged evaluation sets. Dashed lines are the original training mean RMSE for each period."/>
             <wp:cNvGraphicFramePr>
               <a:graphicFrameLocks noChangeAspect="1"/>
             </wp:cNvGraphicFramePr>
@@ -2542,7 +2258,7 @@
               <a:graphicData uri="http://schemas.openxmlformats.org/drawingml/2006/picture">
                 <pic:pic>
                   <pic:nvPicPr>
-                    <pic:cNvPr id="0" name="03_holdout_residuals.png"/>
+                    <pic:cNvPr id="0" name="05_outlier_sensitivity.png"/>
                     <pic:cNvPicPr/>
                   </pic:nvPicPr>
                   <pic:blipFill>
@@ -2554,7 +2270,7 @@
                   <pic:spPr>
                     <a:xfrm>
                       <a:off x="0" y="0"/>
-                      <a:ext cx="6080760" cy="2210330"/>
+                      <a:ext cx="6080760" cy="2564790"/>
                     </a:xfrm>
                     <a:prstGeom prst="rect"/>
                   </pic:spPr>
@@ -2570,12 +2286,12 @@
         <w:pStyle w:val="Caption"/>
       </w:pPr>
       <w:r>
-        <w:t>Figure 3. Held-out raw-return residuals versus prediction and time. Large errors remain; independence and constant variance are not established.</w:t>
+        <w:t>Figure 3. Outlier sensitivity on unchanged evaluation sets. Dashed lines are the original training mean RMSE for each period.</w:t>
       </w:r>
     </w:p>
     <w:p>
       <w:r>
-        <w:t>Training design rank is 11 of 11; removing redundant EPS surprise restores full rank. Cook's distance exceeds the 4/n screening threshold for 17 training events; the largest is AMZN, April 28, 2022 (D = 0.191). These flags do not justify automatic deletion. In held-out data, AAPL's July 31, 2025 event returns +13.326% versus -0.649% predicted, an error of +13.975 pp. Large residuals and weak forecasts motivate robustness checks rather than causal coefficient claims.</w:t>
+        <w:t>Removing seven large-surprise training events helps raw validation error but worsens 2025. Removing 17 influential training events helps 2025 but worsens validation. Clipping has similarly mixed effects, so the original all-event OLS remains primary. Raw errors exceed 5 pp in 16/80 validation and 9/40 test events. AMZN April 28, 2022 has the largest training Cook's distance (0.191); AAPL July 31, 2025 has a held-out error of 13.975 pp. Influence flags do not establish data errors.</w:t>
       </w:r>
     </w:p>
     <w:p>
@@ -2593,52 +2309,22 @@
     </w:p>
     <w:p>
       <w:r>
-        <w:t xml:space="preserve">The pilot supports a modest descriptive association between the initial price reaction and later signed return, but the multivariable baseline does not consistently beat simple forecasts. The original hypothesis of useful post-reaction predictors is therefore </w:t>
-      </w:r>
-      <w:r>
-        <w:rPr>
-          <w:b/>
-        </w:rPr>
-        <w:t>not established</w:t>
-      </w:r>
-      <w:r>
-        <w:t>. These observational associations do not show that earnings or price reactions cause subsequent returns, and forecasting accuracy alone would not establish deployment readiness.</w:t>
+        <w:t>The hypothesis of useful post-reaction prediction is not established. Weak associations and inconsistent reference improvements do not support a trading deployment or causal interpretation. We make no coefficient significance claim: 40 repeated events per company, 148 events sharing reaction dates, and 597 overlapping target-window pairs can create dependent errors. Year/company/volatility tables and leave-one-calendar-quarter-out checks describe instability; they are not independence-based significance tests.</w:t>
       </w:r>
     </w:p>
     <w:p>
-      <w:r/>
       <w:r>
-        <w:rPr>
-          <w:b/>
-        </w:rPr>
-        <w:t>Dependence and selection.</w:t>
-      </w:r>
-      <w:r>
-        <w:t xml:space="preserve"> Each company appears 40 times; 148 events share a reaction date, and 597 pairs have overlapping future windows across companies. There are 0 within-company overlapping target-window pairs. Common market shocks can correlate errors, so 400 rows do not mean 400 independent experiments. Ten currently active large companies omit failed/delisted firms and many industries. No missing observations in this pilot does not eliminate survivorship or selection bias.</w:t>
+        <w:t>Date-only announcements can misidentify the initial reaction for premarket releases. Retrospective EPS estimates and adjusted prices are not guaranteed point-in-time records. Current large-company selection omits failed/delisted firms and limits generalization. Predicting at the close also does not establish an executable trade at that close; spreads and costs remain untested.</w:t>
       </w:r>
     </w:p>
     <w:p>
-      <w:r/>
       <w:r>
-        <w:rPr>
-          <w:b/>
-        </w:rPr>
-        <w:t>Timing and measurement.</w:t>
-      </w:r>
-      <w:r>
-        <w:t xml:space="preserve"> Date-only earnings reports make the first-later-session convention imperfect for premarket releases. Retrospective EPS estimates/surprises and adjusted-price histories are not guaranteed to be the values available at the historical prediction time. Formula checks prevent mechanical future-price leakage but cannot prove point-in-time vendor availability. Predicting at the close also does not establish an executable trade at that exact close; later work needs a tradable entry time, spreads and costs.</w:t>
+        <w:t>The history audit finds 675 pre-2016 earnings records and 631 potential events in 2010-2025, including one with a missing earnings value. They are not yet validated modeling observations; older stock/SPY lookbacks and targets must be obtained first. The Kaggle candidate [5] has 168,603 earnings rows ending June 2021, with 57,256 missing EPS estimates and 60,203 missing release-time labels. It offers some pre/post-market labels but cannot supply 2023-2025 testing. Its price-file completeness and reuse terms need further review; it was not merged into the primary sample.</w:t>
       </w:r>
     </w:p>
     <w:p>
-      <w:r/>
       <w:r>
-        <w:rPr>
-          <w:b/>
-        </w:rPr>
-        <w:t>Milestone 3 priority.</w:t>
-      </w:r>
-      <w:r>
-        <w:t xml:space="preserve"> Evaluate a small set of simple models with rolling chronological origins and label-window purging, fit every transformation within each training fold, and compare with training-mean and zero forecasts. Report performance by company/year and use dependence-aware uncertainty estimates. Check release timing and vendor revisions, then test influence sensitivity and regularization without deleting difficult events. Expand toward 100 stocks only with a documented historical selection rule and available free access. A trading application requires a prespecified entry/exit rule and evidence of benefit after costs.</w:t>
+        <w:t>Milestone 3 should deepen history per company before broadening the universe, report coverage by company/year, and compare simple regularized or longitudinal/company-effect models using rolling chronological splits and purged labels. Earnings events are irregularly spaced. Investigate dependence-aware uncertainty, release timing, vendor revisions and realistic execution. Additional rows or outlier removal should not be used merely to obtain favorable significance.</w:t>
       </w:r>
     </w:p>
     <w:p>
@@ -2646,12 +2332,12 @@
         <w:pStyle w:val="Heading1"/>
       </w:pPr>
       <w:r>
-        <w:t>6 Team contributions and reflection</w:t>
+        <w:t>6 Team responsibilities and reflection</w:t>
       </w:r>
     </w:p>
     <w:p>
       <w:r>
-        <w:t>Our project proposal [1] describes the prior contributions below. The proposed next-stage roles organize the work needed for the next analysis phase.</w:t>
+        <w:t>The proposal describes prior contributions below; next-stage owners are proposed assignments. Confirm actual individual Milestone 2 work before submission.</w:t>
       </w:r>
     </w:p>
     <w:tbl>
@@ -2733,7 +2419,7 @@
                 <w:color w:val="000000"/>
                 <w:sz w:val="16"/>
               </w:rPr>
-              <w:t>Documented prior contribution</w:t>
+              <w:t>Prior contribution</w:t>
             </w:r>
           </w:p>
         </w:tc>
@@ -2766,7 +2452,7 @@
                 <w:color w:val="000000"/>
                 <w:sz w:val="16"/>
               </w:rPr>
-              <w:t>Proposed next-stage ownership</w:t>
+              <w:t>Proposed next stage</w:t>
             </w:r>
           </w:p>
         </w:tc>
@@ -2837,7 +2523,7 @@
                 <w:color w:val="000000"/>
                 <w:sz w:val="16"/>
               </w:rPr>
-              <w:t>Research question, analysis and plots</w:t>
+              <w:t>Analysis and exploratory plots</w:t>
             </w:r>
           </w:p>
         </w:tc>
@@ -2870,7 +2556,7 @@
                 <w:color w:val="000000"/>
                 <w:sz w:val="16"/>
               </w:rPr>
-              <w:t>Rolling evaluation; year/company performance</w:t>
+              <w:t>Year/company performance and rolling evaluation</w:t>
             </w:r>
           </w:p>
         </w:tc>
@@ -2941,7 +2627,7 @@
                 <w:color w:val="000000"/>
                 <w:sz w:val="16"/>
               </w:rPr>
-              <w:t>Predictor research; cleaning/analysis with Cindy</w:t>
+              <w:t>Cleaning and analysis with Cindy</w:t>
             </w:r>
           </w:p>
         </w:tc>
@@ -2974,7 +2660,7 @@
                 <w:color w:val="000000"/>
                 <w:sz w:val="16"/>
               </w:rPr>
-              <w:t>Missingness, unusual values and feature audit</w:t>
+              <w:t>Outlier review and sensitivity tables</w:t>
             </w:r>
           </w:p>
         </w:tc>
@@ -3045,7 +2731,7 @@
                 <w:color w:val="000000"/>
                 <w:sz w:val="16"/>
               </w:rPr>
-              <w:t>Stock research; cleaning/analysis with Sarah</w:t>
+              <w:t>Data preparation and analysis with Sarah</w:t>
             </w:r>
           </w:p>
         </w:tc>
@@ -3078,7 +2764,7 @@
                 <w:color w:val="000000"/>
                 <w:sz w:val="16"/>
               </w:rPr>
-              <w:t>Release-time and point-in-time checks</w:t>
+              <w:t>Older history and release-time audit</w:t>
             </w:r>
           </w:p>
         </w:tc>
@@ -3149,7 +2835,7 @@
                 <w:color w:val="000000"/>
                 <w:sz w:val="16"/>
               </w:rPr>
-              <w:t>Application, proposal writing, initial cleaning</w:t>
+              <w:t>Proposal writing and initial cleaning</w:t>
             </w:r>
           </w:p>
         </w:tc>
@@ -3182,7 +2868,7 @@
                 <w:color w:val="000000"/>
                 <w:sz w:val="16"/>
               </w:rPr>
-              <w:t>Limitations, decision rule and report writing</w:t>
+              <w:t>Interpretation and dataset-expansion review</w:t>
             </w:r>
           </w:p>
         </w:tc>
@@ -3253,7 +2939,7 @@
                 <w:color w:val="000000"/>
                 <w:sz w:val="16"/>
               </w:rPr>
-              <w:t>Target refinement and GitHub collaboration</w:t>
+              <w:t>Target refinement and GitHub coordination</w:t>
             </w:r>
           </w:p>
         </w:tc>
@@ -3286,7 +2972,7 @@
                 <w:color w:val="000000"/>
                 <w:sz w:val="16"/>
               </w:rPr>
-              <w:t>Reproducibility, baseline code and packaging</w:t>
+              <w:t>Reproducibility and evaluation implementation</w:t>
             </w:r>
           </w:p>
         </w:tc>
@@ -3311,7 +2997,7 @@
         <w:t>Reflection.</w:t>
       </w:r>
       <w:r>
-        <w:t xml:space="preserve"> Defining signed targets and explicit event timing made the question testable. A complete dataset did not resolve dependence, sample selection or historical availability. The training-mean comparison showed that the regression did not consistently improve forecasting, and the exact EPS identity required removal of a redundant predictor. These findings support checking the evaluation design and data quality before adding model complexity.</w:t>
+        <w:t xml:space="preserve"> A complete dataset did not ensure informative predictions. The naive comparison exposed weak forecasting performance; outlier checks showed that deleting difficult training events did not consistently solve it. The TA's emphasis on data history and quality led to concrete coverage and sensitivity audits rather than a claim of significance. The original signed target and full held-out samples remain intact.</w:t>
       </w:r>
     </w:p>
     <w:p>
@@ -3331,7 +3017,7 @@
         <w:rPr>
           <w:sz w:val="17"/>
         </w:rPr>
-        <w:t xml:space="preserve"> OpenAI Codex assisted with code, diagnostics, report drafting and packaging. Results were computed from existing real-data caches. Team review and verification of the analysis and explanations remain necessary; disclosure must follow the course syllabus.</w:t>
+        <w:t xml:space="preserve"> OpenAI Codex assisted with implementation, analysis, writing and packaging. The group must review and understand the methods, verify individual contributions and follow syllabus disclosure requirements.</w:t>
       </w:r>
     </w:p>
     <w:p>
@@ -3346,7 +3032,7 @@
         <w:t>Reproducibility and references.</w:t>
       </w:r>
       <w:r>
-        <w:t xml:space="preserve"> Run run_pipeline.py, then run_milestone2.py; see MILESTONE2_README.md and pinned package versions. Editable Word version: reports/build_word_documents.py. Original numerical analysis: run_milestone2.py. Snapshot hashes and full diagnostics are in outputs/milestone2.</w:t>
+        <w:t xml:space="preserve"> Run run_pipeline.py, then run_milestone2.py. Optional audit_kaggle.py --download reproduces the separate candidate audit. See MILESTONE2_README.md for exact versions, paths and source hashes.</w:t>
       </w:r>
     </w:p>
     <w:p>
@@ -3354,7 +3040,7 @@
         <w:pStyle w:val="Caption"/>
       </w:pPr>
       <w:r>
-        <w:t>[1] Group 9, ISYE 4031 Project.pdf, supplied team notes and Milestone 1 proposal, pp. 1-3, 6-8.</w:t>
+        <w:t>[1] Meeting 1 notes supplied by the group October 27, 2026; reports/MEETING1_FEEDBACK.md.</w:t>
       </w:r>
     </w:p>
     <w:p>
@@ -3362,7 +3048,7 @@
         <w:pStyle w:val="Caption"/>
       </w:pPr>
       <w:r>
-        <w:t>[2] ISYE4031_Milestone2_Students.pdf, supplied course brief, Fall 2026.</w:t>
+        <w:t>[2] ISYE4031_Milestone2_Students.pdf, Fall 2026 course brief.</w:t>
       </w:r>
     </w:p>
     <w:p>
@@ -3370,7 +3056,7 @@
         <w:pStyle w:val="Caption"/>
       </w:pPr>
       <w:r>
-        <w:t>[3] Alpha Vantage, EARNINGS documentation: alphavantage.co/documentation/#earnings.</w:t>
+        <w:t>[3] Alpha Vantage EARNINGS: alphavantage.co/documentation/#earnings.</w:t>
       </w:r>
     </w:p>
     <w:p>
@@ -3378,7 +3064,7 @@
         <w:pStyle w:val="Caption"/>
       </w:pPr>
       <w:r>
-        <w:t>[4] yfinance, PriceHistory documentation: ranaroussi.github.io/yfinance/reference/yfinance.price_history.html.</w:t>
+        <w:t>[4] yfinance PriceHistory: ranaroussi.github.io/yfinance/reference/yfinance.price_history.html.</w:t>
       </w:r>
     </w:p>
     <w:p>
@@ -3386,15 +3072,7 @@
         <w:pStyle w:val="Caption"/>
       </w:pPr>
       <w:r>
-        <w:t>[5] scikit-learn, Ordinary Least Squares: scikit-learn.org/stable/modules/linear_model.html.</w:t>
-      </w:r>
-    </w:p>
-    <w:p>
-      <w:pPr>
-        <w:pStyle w:val="Caption"/>
-      </w:pPr>
-      <w:r>
-        <w:t>Online documentation checked October 11, 2026. Data are from the existing cached snapshot, not that access date.</w:t>
+        <w:t>[5] tsaustin, US historical stock prices with earnings data, Kaggle version 7; kaggle.com/datasets/tsaustin/us-historical-stock-prices-with-earnings-data. Candidate summary and earnings files audited October 27, 2026.</w:t>
       </w:r>
     </w:p>
     <w:sectPr>

</xml_diff>